<commit_message>
GO single cell comparison
</commit_message>
<xml_diff>
--- a/documents/Rebuttal02032026.docx
+++ b/documents/Rebuttal02032026.docx
@@ -1695,6 +1695,164 @@
     <w:p>
       <w:pPr>
         <w:rPr>
+          <w:bCs/>
+        </w:rPr>
+      </w:pPr>
+      <w:r>
+        <w:rPr>
+          <w:b/>
+        </w:rPr>
+        <w:t>Response (Comment 2.4).</w:t>
+      </w:r>
+      <w:r>
+        <w:br/>
+      </w:r>
+      <w:r>
+        <w:br/>
+      </w:r>
+      <w:r>
+        <w:rPr>
+          <w:b/>
+        </w:rPr>
+        <w:t xml:space="preserve">Other single-cell technologies. </w:t>
+      </w:r>
+      <w:r>
+        <w:t>To test whether GMP-Cor is specific to our probe-based protocol, we applied it to two independent E. coli scRNA-seq datasets from Ma et al.</w:t>
+      </w:r>
+      <w:r>
+        <w:t xml:space="preserve"> (appearing now in </w:t>
+      </w:r>
+      <w:r>
+        <w:rPr>
+          <w:highlight w:val="yellow"/>
+        </w:rPr>
+        <w:t>Fig. 2F-G</w:t>
+      </w:r>
+      <w:r>
+        <w:t>)</w:t>
+      </w:r>
+      <w:r>
+        <w:t>, generated with a fundamentally different single-cell technique</w:t>
+      </w:r>
+      <w:r>
+        <w:t xml:space="preserve">. </w:t>
+      </w:r>
+      <w:r>
+        <w:t xml:space="preserve">Despite the different capture chemistry, library structure, and sparsity profile, GMP-Cor reproduced the expected </w:t>
+      </w:r>
+      <w:r>
+        <w:t xml:space="preserve">range for </w:t>
+      </w:r>
+      <w:r>
+        <w:lastRenderedPageBreak/>
+        <w:t>actively growing</w:t>
+      </w:r>
+      <w:r>
+        <w:t xml:space="preserve"> cells </w:t>
+      </w:r>
+      <w:r>
+        <w:rPr>
+          <w:highlight w:val="yellow"/>
+        </w:rPr>
+        <w:t>(GMP-Cor ≈ [X</w:t>
+      </w:r>
+      <w:r>
+        <w:rPr>
+          <w:highlight w:val="yellow"/>
+        </w:rPr>
+        <w:t>]).</w:t>
+      </w:r>
+      <w:r>
+        <w:t xml:space="preserve"> It is important to note, that because different techniques generate very different data in terms of SNR and sparsity, it is important to compare GMP-Cor within the same technique to make conclusions on wether a response in regulated/dysregulated. </w:t>
+      </w:r>
+      <w:r>
+        <w:br/>
+      </w:r>
+      <w:r>
+        <w:br/>
+      </w:r>
+      <w:r>
+        <w:rPr>
+          <w:b/>
+        </w:rPr>
+        <w:t xml:space="preserve">Larger cell numbers. </w:t>
+      </w:r>
+      <w:r>
+        <w:t>These external datasets also span a wider range of cell numbers than our own conditions, and the subsampling analysis (Comment 2.3) establishes the behavior of the metric across that range, including the gene-dimension matching required for cross-dataset comparison.</w:t>
+      </w:r>
+      <w:r>
+        <w:br/>
+      </w:r>
+      <w:r>
+        <w:br/>
+      </w:r>
+      <w:r>
+        <w:rPr>
+          <w:b/>
+        </w:rPr>
+        <w:t xml:space="preserve">A different biological system. </w:t>
+      </w:r>
+      <w:r>
+        <w:t xml:space="preserve">To probe generalizability beyond bacteria, we are additionally applying GMP-Cor to single-cell data from drug-tolerant cancer persister cells (Oren et al.). This analysis is ongoing; our preliminary aim is to test whether the loss of global gene–gene coordination captured by GMP-Cor in bacterial Dis-Arrest also distinguishes drug-tolerant from cycling cancer populations, which would indicate that the signature is a generic feature of </w:t>
+      </w:r>
+      <w:r>
+        <w:t>living cells and not only</w:t>
+      </w:r>
+      <w:r>
+        <w:t xml:space="preserve"> bacteria</w:t>
+      </w:r>
+      <w:r>
+        <w:t xml:space="preserve"> under</w:t>
+      </w:r>
+      <w:r>
+        <w:t xml:space="preserve"> stress. We will include this as a preliminary cross-system extension and have moved the broader cross-system framing to the Discussion, consistent with the scope of the data.</w:t>
+      </w:r>
+      <w:r>
+        <w:br/>
+      </w:r>
+      <w:r>
+        <w:br/>
+      </w:r>
+      <w:r>
+        <w:rPr>
+          <w:b/>
+        </w:rPr>
+        <w:t xml:space="preserve">Bulk RNA-seq compendia. </w:t>
+      </w:r>
+      <w:r>
+        <w:t>We emphasize that GMP-Cor is intrinsically a single-cell quantity (see Comment 1): it is the eigenvalue spectrum of the gene–gene correlation matrix computed across cells. A bulk compendium provides one averaged expression vector per sample and cannot define a correlation spectrum within a condition. The metric is, however, applicable to any data with single-cell resolution, as the Ma et al. analysis demonstrates.</w:t>
+      </w:r>
+      <w:r>
+        <w:br/>
+      </w:r>
+      <w:r>
+        <w:br/>
+      </w:r>
+      <w:r>
+        <w:rPr>
+          <w:b/>
+        </w:rPr>
+        <w:t xml:space="preserve">Practical leverage for therapy. </w:t>
+      </w:r>
+      <w:r>
+        <w:t xml:space="preserve">We have clarified the intended application. GMP-Cor is a culture-level readout of how strongly transcription is coordinated, and we propose two concrete uses. (i) As a biomarker for persister-prone states: because dysregulated (low GMP-Cor) cultures are enriched for the long-lag, tolerance-associated cells, GMP-Cor can flag treatment conditions or genetic backgrounds likely to generate persisters, helping prioritize regimens that avoid driving cells into the dysregulated state. (ii) As a screening endpoint: perturbations (drug combinations, adjuvants) can be ranked by their effect on GMP-Cor, identifying interventions that restore regulatory coordination (raising GMP-Cor) and thereby reduce the dysregulation-associated tolerant fraction, rather than relying on </w:t>
+      </w:r>
+      <w:r>
+        <w:t xml:space="preserve">inhibiting </w:t>
+      </w:r>
+      <w:r>
+        <w:t>single persistence gene</w:t>
+      </w:r>
+      <w:r>
+        <w:t>s</w:t>
+      </w:r>
+      <w:r>
+        <w:t>, which our framework predicts will be irreproducible when persistence arises from global dysregulation.</w:t>
+      </w:r>
+    </w:p>
+    <w:p>
+      <w:pPr>
+        <w:rPr>
           <w:i/>
           <w:iCs/>
           <w:color w:val="2E74B5" w:themeColor="accent5" w:themeShade="BF"/>
@@ -1777,18 +1935,273 @@
           <w:color w:val="2E74B5" w:themeColor="accent5" w:themeShade="BF"/>
           <w:shd w:val="clear" w:color="auto" w:fill="FFFFFF"/>
         </w:rPr>
-        <w:t xml:space="preserve">showed a loss of gene-gene correlations during non-adaptive stress responses and a loss of fitness. Moreover, a second a prior study from the same group (doi: 10.1038/s41467-020-18134-z) used transcriptomic entropy to quantify the stress response in bulk RNA-seq data, where increased entropy is associated with dysregulation loss of fitness and survival. Importantly, in the introduction of </w:t>
-      </w:r>
-      <w:r>
-        <w:rPr>
-          <w:rFonts w:ascii="Arial" w:hAnsi="Arial" w:cs="Arial"/>
-          <w:i/>
-          <w:iCs/>
-          <w:color w:val="2E74B5" w:themeColor="accent5" w:themeShade="BF"/>
-          <w:shd w:val="clear" w:color="auto" w:fill="FFFFFF"/>
+        <w:t xml:space="preserve">showed a loss of gene-gene correlations during non-adaptive stress responses and a loss of fitness. Moreover, a second a prior study from the same group (doi: 10.1038/s41467-020-18134-z) used transcriptomic entropy to quantify the stress response in bulk RNA-seq data, where increased entropy is associated with dysregulation loss of fitness and survival. Importantly, in the introduction of this manuscript that paper is </w:t>
+      </w:r>
+      <w:r>
+        <w:rPr>
+          <w:rFonts w:ascii="Arial" w:hAnsi="Arial" w:cs="Arial"/>
+          <w:i/>
+          <w:iCs/>
+          <w:color w:val="2E74B5" w:themeColor="accent5" w:themeShade="BF"/>
+          <w:highlight w:val="yellow"/>
+          <w:shd w:val="clear" w:color="auto" w:fill="FFFFFF"/>
+        </w:rPr>
+        <w:t>referenced</w:t>
+      </w:r>
+      <w:r>
+        <w:rPr>
+          <w:rFonts w:ascii="Arial" w:hAnsi="Arial" w:cs="Arial"/>
+          <w:i/>
+          <w:iCs/>
+          <w:color w:val="2E74B5" w:themeColor="accent5" w:themeShade="BF"/>
+          <w:highlight w:val="yellow"/>
+          <w:shd w:val="clear" w:color="auto" w:fill="FFFFFF"/>
+        </w:rPr>
+        <w:t xml:space="preserve"> but its main conclusions are misrepresented</w:t>
+      </w:r>
+      <w:r>
+        <w:rPr>
+          <w:rFonts w:ascii="Arial" w:hAnsi="Arial" w:cs="Arial"/>
+          <w:i/>
+          <w:iCs/>
+          <w:color w:val="2E74B5" w:themeColor="accent5" w:themeShade="BF"/>
+          <w:shd w:val="clear" w:color="auto" w:fill="FFFFFF"/>
+        </w:rPr>
+        <w:t>. In addition, the GMP correlation index developed in the current study appears conceptually related, as both aim to capture global dysregulation rather than specific pathway changes</w:t>
+      </w:r>
+      <w:r>
+        <w:rPr>
+          <w:rFonts w:ascii="Arial" w:hAnsi="Arial" w:cs="Arial"/>
+          <w:i/>
+          <w:iCs/>
+          <w:color w:val="2E74B5" w:themeColor="accent5" w:themeShade="BF"/>
+          <w:highlight w:val="yellow"/>
+          <w:shd w:val="clear" w:color="auto" w:fill="FFFFFF"/>
+        </w:rPr>
+        <w:t>. It is important the authors integrate and reference these prior findings properly into this manuscript, and they should specifically show the advantages and/or limitations of the GMP correlation index relative to entropy-based metrics.</w:t>
+      </w:r>
+      <w:r>
+        <w:rPr>
+          <w:rFonts w:ascii="Arial" w:hAnsi="Arial" w:cs="Arial"/>
+          <w:i/>
+          <w:iCs/>
+          <w:color w:val="2E74B5" w:themeColor="accent5" w:themeShade="BF"/>
+        </w:rPr>
+        <w:br/>
+      </w:r>
+      <w:r>
+        <w:rPr>
+          <w:rFonts w:ascii="Arial" w:hAnsi="Arial" w:cs="Arial"/>
+          <w:i/>
+          <w:iCs/>
+          <w:color w:val="2E74B5" w:themeColor="accent5" w:themeShade="BF"/>
+        </w:rPr>
+        <w:br/>
+      </w:r>
+    </w:p>
+    <w:p>
+      <w:r>
+        <w:rPr>
+          <w:b/>
         </w:rPr>
         <w:lastRenderedPageBreak/>
-        <w:t xml:space="preserve">this manuscript that paper is </w:t>
+        <w:t>Response (Comment 2.5).</w:t>
+      </w:r>
+      <w:r>
+        <w:br/>
+      </w:r>
+      <w:r>
+        <w:br/>
+        <w:t>We thank the reviewer for pointing us to these studies, which are indeed closely related, and we have corrected and expanded our treatment of them.</w:t>
+      </w:r>
+      <w:r>
+        <w:t xml:space="preserve"> </w:t>
+      </w:r>
+      <w:r>
+        <w:t>We have rewritten the passage citing Zhu et al. so that its conclusions are represented accurately: that work used transcriptomic entropy on bulk RNA-seq to show that increased entropy accompanies a disorganized, non-adaptive stress response and is associated with reduced fitness and survival. We previously summarized this incorrectly and have fixed it.</w:t>
+      </w:r>
+      <w:r>
+        <w:br/>
+        <w:t xml:space="preserve">We now also cite </w:t>
+      </w:r>
+      <w:r>
+        <w:t>Jensen</w:t>
+      </w:r>
+      <w:r>
+        <w:t xml:space="preserve"> et al., which reported a loss of gene–gene correlation during non-adaptive stress and its link to loss of fitness. This is the closest precedent to our observable, and we present it as direct conceptual support: that study demonstrated the phenomenon at the bulk/across-condition level, whereas GMP-Cor quantifies the same loss of coordination within a single condition at single-cell resolution, with a built-in noise null.</w:t>
+      </w:r>
+      <w:r>
+        <w:br/>
+      </w:r>
+      <w:r>
+        <w:br/>
+      </w:r>
+      <w:r>
+        <w:rPr>
+          <w:b/>
+        </w:rPr>
+        <w:t xml:space="preserve">Advantages and limitations versus entropy. </w:t>
+      </w:r>
+      <w:r>
+        <w:t xml:space="preserve">The two approaches are complementary and address different questions on different data. Transcriptomic entropy measures the disorder of an expression distribution and is naturally a bulk, across-perturbation readout — it characterizes how broadly cells sample expression space </w:t>
+      </w:r>
+      <w:r>
+        <w:t>after a perturbation</w:t>
+      </w:r>
+      <w:r>
+        <w:t>, and it requires a defined reference distribution</w:t>
+      </w:r>
+      <w:r>
+        <w:t xml:space="preserve"> and time series</w:t>
+      </w:r>
+      <w:r>
+        <w:t>. GMP-Cor, by contrast, is a single-cell, within-condition measure of whether the gene–gene correlation structure is preserved relative to a scrambled null, and so requires no external reference</w:t>
+      </w:r>
+      <w:r>
+        <w:t xml:space="preserve">. </w:t>
+      </w:r>
+      <w:r>
+        <w:t xml:space="preserve">Their respective limitations follow directly: entropy cannot be computed within a single steady-state snapshot </w:t>
+      </w:r>
+      <w:r>
+        <w:t xml:space="preserve">of time </w:t>
+      </w:r>
+      <w:r>
+        <w:t>at single-cell resolution</w:t>
+      </w:r>
+      <w:r>
+        <w:t>. This is precisely</w:t>
+      </w:r>
+      <w:r>
+        <w:t xml:space="preserve"> the regime in which Dis-Arrest is defined</w:t>
+      </w:r>
+      <w:r>
+        <w:t xml:space="preserve"> (usually &gt;24 hours after the perturbation) </w:t>
+      </w:r>
+      <w:r>
+        <w:t xml:space="preserve">where </w:t>
+      </w:r>
+      <w:r>
+        <w:t>arrested</w:t>
+      </w:r>
+      <w:r>
+        <w:t xml:space="preserve"> cells are </w:t>
+      </w:r>
+      <w:r>
+        <w:t>already</w:t>
+      </w:r>
+      <w:r>
+        <w:t xml:space="preserve"> </w:t>
+      </w:r>
+      <w:r>
+        <w:t>at a steady state.</w:t>
+      </w:r>
+      <w:r>
+        <w:t xml:space="preserve"> GMP-Cor is extensive in gene number and requires single-cell data</w:t>
+      </w:r>
+      <w:r>
+        <w:t>, which can be less accessable than bulk data, especially in bacterial studies</w:t>
+      </w:r>
+      <w:r>
+        <w:t>. The metrics therefore capture global dysregulation from two complementary vantage points rather than substituting for one another.</w:t>
+      </w:r>
+    </w:p>
+    <w:p>
+      <w:r>
+        <w:t>We added to the introduction the following sentences, representing the main conclusions of the discussed paper and comparing our it to our approach:</w:t>
+      </w:r>
+    </w:p>
+    <w:p>
+      <w:r>
+        <w:rPr>
+          <w:i/>
+          <w:iCs/>
+        </w:rPr>
+        <w:t>“</w:t>
+      </w:r>
+      <w:r>
+        <w:rPr>
+          <w:i/>
+          <w:iCs/>
+        </w:rPr>
+        <w:t>It was shown that the transcriptomic entropy of a stress response quantifies how dysregulated the global expression program is, and that higher entropy predicts reduced fitness and increased antibiotic sensitivity across conditions. This established that the degree of organization of a stress response, rather than any single pathway, carries predictive information. We extend this principal by asking whether gene–gene coordination is preserved within a steady-state population of cells deep in Dis-Arrest (long after a strong perturbation).</w:t>
+      </w:r>
+      <w:r>
+        <w:rPr>
+          <w:i/>
+          <w:iCs/>
+        </w:rPr>
+        <w:t>”</w:t>
+      </w:r>
+      <w:r>
+        <w:br/>
+      </w:r>
+      <w:r>
+        <w:br/>
+      </w:r>
+      <w:r>
+        <w:rPr>
+          <w:b/>
+        </w:rPr>
+        <w:t xml:space="preserve">Jensen et al. (2017). </w:t>
+      </w:r>
+      <w:r>
+        <w:t>As also raised by Reviewer #4, we have added a brief Discussion paragraph relating our work to the Tn-seq vs. RNA-seq comparisons from the same group, noting the shared theme of connecting global expression organization to fitness while distinguishing our correlation-spectrum approach</w:t>
+      </w:r>
+      <w:r>
+        <w:t>:</w:t>
+      </w:r>
+    </w:p>
+    <w:p>
+      <w:pPr>
+        <w:rPr>
+          <w:bCs/>
+          <w:lang w:val="en-US"/>
+        </w:rPr>
+      </w:pPr>
+      <w:r>
+        <w:t>“</w:t>
+      </w:r>
+      <w:r>
+        <w:t>Non-adaptive stress-responses have been shown to be associated with dysregulation. For example, Jensen et al. showed that antibiotics decouple the transcriptional response from the genes required for survival</w:t>
+      </w:r>
+      <w:r>
+        <w:t>,</w:t>
+      </w:r>
+      <w:r>
+        <w:t xml:space="preserve"> and the transcriptomic-entropy measure later generalized this, with more disordered responses predicting lower fitness</w:t>
+      </w:r>
+      <w:r>
+        <w:t xml:space="preserve">. </w:t>
+      </w:r>
+      <w:r>
+        <w:t xml:space="preserve">GMP-Cor captures the same loss of coordination but from a single time-point dataset alone, measuring gene-gene correlation structure within the transcriptome </w:t>
+      </w:r>
+      <w:r>
+        <w:lastRenderedPageBreak/>
+        <w:t>rather than its agreement with an external fitness assay, providing a complementary readout of dysregulation.</w:t>
+      </w:r>
+      <w:r>
+        <w:t>”</w:t>
+      </w:r>
+    </w:p>
+    <w:p>
+      <w:pPr>
+        <w:rPr>
+          <w:i/>
+          <w:iCs/>
+          <w:color w:val="2E74B5" w:themeColor="accent5" w:themeShade="BF"/>
+        </w:rPr>
+      </w:pPr>
+      <w:r>
+        <w:rPr>
+          <w:rFonts w:ascii="Arial" w:hAnsi="Arial" w:cs="Arial"/>
+          <w:i/>
+          <w:iCs/>
+          <w:color w:val="2E74B5" w:themeColor="accent5" w:themeShade="BF"/>
+          <w:shd w:val="clear" w:color="auto" w:fill="FFFFFF"/>
+        </w:rPr>
+        <w:t>3. It is unclear why the GO term analysis was not performed on the scRNA-seq dataset, which would have made the analysis more consistent with the results presented in Section 2.1.</w:t>
       </w:r>
       <w:r>
         <w:rPr>
@@ -1799,7 +2212,17 @@
           <w:highlight w:val="yellow"/>
           <w:shd w:val="clear" w:color="auto" w:fill="FFFFFF"/>
         </w:rPr>
-        <w:t>referenced</w:t>
+        <w:t>Could the authors perform GO term enrichment analysis using the scRNA-seq data as well, including analyses considering subpopulation</w:t>
+      </w:r>
+      <w:r>
+        <w:rPr>
+          <w:rFonts w:ascii="Arial" w:hAnsi="Arial" w:cs="Arial"/>
+          <w:i/>
+          <w:iCs/>
+          <w:color w:val="2E74B5" w:themeColor="accent5" w:themeShade="BF"/>
+          <w:shd w:val="clear" w:color="auto" w:fill="FFFFFF"/>
+        </w:rPr>
+        <w:t xml:space="preserve">s? Additionally, it would be helpful to know how </w:t>
       </w:r>
       <w:r>
         <w:rPr>
@@ -1810,87 +2233,6 @@
           <w:highlight w:val="yellow"/>
           <w:shd w:val="clear" w:color="auto" w:fill="FFFFFF"/>
         </w:rPr>
-        <w:t xml:space="preserve"> but its main conclusions are misrepresented</w:t>
-      </w:r>
-      <w:r>
-        <w:rPr>
-          <w:rFonts w:ascii="Arial" w:hAnsi="Arial" w:cs="Arial"/>
-          <w:i/>
-          <w:iCs/>
-          <w:color w:val="2E74B5" w:themeColor="accent5" w:themeShade="BF"/>
-          <w:shd w:val="clear" w:color="auto" w:fill="FFFFFF"/>
-        </w:rPr>
-        <w:t>. In addition, the GMP correlation index developed in the current study appears conceptually related, as both aim to capture global dysregulation rather than specific pathway changes</w:t>
-      </w:r>
-      <w:r>
-        <w:rPr>
-          <w:rFonts w:ascii="Arial" w:hAnsi="Arial" w:cs="Arial"/>
-          <w:i/>
-          <w:iCs/>
-          <w:color w:val="2E74B5" w:themeColor="accent5" w:themeShade="BF"/>
-          <w:highlight w:val="yellow"/>
-          <w:shd w:val="clear" w:color="auto" w:fill="FFFFFF"/>
-        </w:rPr>
-        <w:t>. It is important the authors integrate and reference these prior findings properly into this manuscript, and they should specifically show the advantages and/or limitations of the GMP correlation index relative to entropy-based metrics.</w:t>
-      </w:r>
-      <w:r>
-        <w:rPr>
-          <w:rFonts w:ascii="Arial" w:hAnsi="Arial" w:cs="Arial"/>
-          <w:i/>
-          <w:iCs/>
-          <w:color w:val="2E74B5" w:themeColor="accent5" w:themeShade="BF"/>
-        </w:rPr>
-        <w:br/>
-      </w:r>
-      <w:r>
-        <w:rPr>
-          <w:rFonts w:ascii="Arial" w:hAnsi="Arial" w:cs="Arial"/>
-          <w:i/>
-          <w:iCs/>
-          <w:color w:val="2E74B5" w:themeColor="accent5" w:themeShade="BF"/>
-        </w:rPr>
-        <w:br/>
-      </w:r>
-      <w:r>
-        <w:rPr>
-          <w:rFonts w:ascii="Arial" w:hAnsi="Arial" w:cs="Arial"/>
-          <w:i/>
-          <w:iCs/>
-          <w:color w:val="2E74B5" w:themeColor="accent5" w:themeShade="BF"/>
-          <w:shd w:val="clear" w:color="auto" w:fill="FFFFFF"/>
-        </w:rPr>
-        <w:t>3. It is unclear why the GO term analysis was not performed on the scRNA-seq dataset, which would have made the analysis more consistent with the results presented in Section 2.1.</w:t>
-      </w:r>
-      <w:r>
-        <w:rPr>
-          <w:rFonts w:ascii="Arial" w:hAnsi="Arial" w:cs="Arial"/>
-          <w:i/>
-          <w:iCs/>
-          <w:color w:val="2E74B5" w:themeColor="accent5" w:themeShade="BF"/>
-          <w:highlight w:val="yellow"/>
-          <w:shd w:val="clear" w:color="auto" w:fill="FFFFFF"/>
-        </w:rPr>
-        <w:t>Could the authors perform GO term enrichment analysis using the scRNA-seq data as well, including analyses considering subpopulation</w:t>
-      </w:r>
-      <w:r>
-        <w:rPr>
-          <w:rFonts w:ascii="Arial" w:hAnsi="Arial" w:cs="Arial"/>
-          <w:i/>
-          <w:iCs/>
-          <w:color w:val="2E74B5" w:themeColor="accent5" w:themeShade="BF"/>
-          <w:shd w:val="clear" w:color="auto" w:fill="FFFFFF"/>
-        </w:rPr>
-        <w:t xml:space="preserve">s? Additionally, it would be helpful to know how </w:t>
-      </w:r>
-      <w:r>
-        <w:rPr>
-          <w:rFonts w:ascii="Arial" w:hAnsi="Arial" w:cs="Arial"/>
-          <w:i/>
-          <w:iCs/>
-          <w:color w:val="2E74B5" w:themeColor="accent5" w:themeShade="BF"/>
-          <w:highlight w:val="yellow"/>
-          <w:shd w:val="clear" w:color="auto" w:fill="FFFFFF"/>
-        </w:rPr>
         <w:t>well the scRNA-seq data correlate with the bulk RNA-seq data used for the GO enrichment analysis.</w:t>
       </w:r>
       <w:r>
@@ -1911,6 +2253,76 @@
         </w:rPr>
         <w:br/>
       </w:r>
+    </w:p>
+    <w:p>
+      <w:pPr>
+        <w:rPr>
+          <w:i/>
+          <w:iCs/>
+          <w:color w:val="2E74B5" w:themeColor="accent5" w:themeShade="BF"/>
+        </w:rPr>
+      </w:pPr>
+      <w:r>
+        <w:rPr>
+          <w:b/>
+        </w:rPr>
+        <w:t xml:space="preserve">Response (Comment 3).</w:t>
+      </w:r>
+      <w:r>
+        <w:br/>
+        <w:br/>
+      </w:r>
+      <w:r>
+        <w:t xml:space="preserve">We thank the reviewer. We have now (i) performed GO enrichment on the scRNA-seq data and (ii) quantified the agreement between the scRNA-seq and bulk RNA-seq data, both reported in new supplementary material.</w:t>
+      </w:r>
+      <w:r>
+        <w:br/>
+        <w:br/>
+      </w:r>
+      <w:r>
+        <w:rPr>
+          <w:b/>
+        </w:rPr>
+        <w:t xml:space="preserve">GO enrichment on scRNA-seq. </w:t>
+      </w:r>
+      <w:r>
+        <w:t xml:space="preserve">GO/GSEA require a per-condition differential-expression contrast rather than a per-cell quantity, so we aggregated the single-cell counts into per-replicate pseudobulk profiles (full gene panel) and ran the same DESeq2 → goatools pipeline used for the bulk data in Section 2.1, using a matched study set of the 500 most strongly down-regulated genes in each condition. The single-cell data recover the same growth-arrest GO terms as the bulk analysis (translation, ribosome biogenesis, flagellar motility, chemotaxis, TCA cycle, ATP synthesis), confirming consistency between the two. Among the terms significant in both conditions, the core translation/ribosome-biogenesis program is far more strongly and coherently enriched in Reg-Arrest than in Dis-Arrest (e.g., “translation” FDR ≈ 10⁻³⁷ vs 10⁻⁴, “cytoplasmic translation” comparable; new Supplementary Fig. [N]) — the single-cell counterpart of the weaker coherent repression of the growth program reported in Section 2.1. For the remaining shared terms the difference between conditions is not statistically significant.</w:t>
+      </w:r>
+      <w:r>
+        <w:br/>
+        <w:br/>
+      </w:r>
+      <w:r>
+        <w:rPr>
+          <w:b/>
+        </w:rPr>
+        <w:t xml:space="preserve">Considering subpopulations. </w:t>
+      </w:r>
+      <w:r>
+        <w:t xml:space="preserve">As detailed in our responses to Comments 1 and 2.3, we do not observe distinct functional subpopulations within a condition: the two clusters visible in Fig. 1H arise from forcing a higher clustering resolution, do not separate growing from non-growing cells (marker-gene analysis), and one of them also absorbs cells from other conditions. A per-subpopulation GO contrast is therefore not biologically meaningful here, and the pseudobulk analysis above already integrates the entire cell population of each condition.</w:t>
+      </w:r>
+      <w:r>
+        <w:br/>
+        <w:br/>
+      </w:r>
+      <w:r>
+        <w:rPr>
+          <w:b/>
+        </w:rPr>
+        <w:t xml:space="preserve">scRNA-seq vs bulk correlation. </w:t>
+      </w:r>
+      <w:r>
+        <w:t xml:space="preserve">We quantified the agreement between the two data types across the full gene panel (new Supplementary Fig. [M]). Per-gene mean expression (Dis-Arrest scRNA-seq vs Disrupted bulk) is correlated across ~3,100 shared genes (Pearson r = 0.61, Spearman ρ = 0.56), and the single-cell pseudobulk log2 fold-changes track the bulk DESeq2 log2 fold-changes (Dis-Arrest vs control: Pearson r = 0.61 over ~3,500 genes; Reg-Arrest vs control: r = 0.33). We note, however, that the bulk and single-cell data were generated by different experimental techniques: the single-cell protocol relies on a pre-synthesized cDNA probe set, whose composition and capture efficiency differ from bulk RNA-seq. This unavoidably shapes the measured gene abundances, the gene–gene correlations, and every downstream analysis, so perfect agreement with bulk is not expected. The substantial positive correlation at both the expression and fold-change level nonetheless supports the internal consistency of the bulk-based GO analysis with the single-cell data.</w:t>
+      </w:r>
+    </w:p>
+    <w:p>
+      <w:pPr>
+        <w:rPr>
+          <w:i/>
+          <w:iCs/>
+          <w:color w:val="2E74B5" w:themeColor="accent5" w:themeShade="BF"/>
+        </w:rPr>
+      </w:pPr>
       <w:r>
         <w:rPr>
           <w:rFonts w:ascii="Arial" w:hAnsi="Arial" w:cs="Arial"/>
@@ -2227,62 +2639,52 @@
           <w:color w:val="2E74B5" w:themeColor="accent5" w:themeShade="BF"/>
           <w:shd w:val="clear" w:color="auto" w:fill="FFFFFF"/>
         </w:rPr>
-        <w:t xml:space="preserve">I co-reviewed this manuscript with one of the reviewers who provided the listed reports. This is part of the Nature Communications initiative to facilitate training in peer review and to </w:t>
-      </w:r>
-      <w:r>
-        <w:rPr>
-          <w:rFonts w:ascii="Arial" w:hAnsi="Arial" w:cs="Arial"/>
-          <w:i/>
-          <w:iCs/>
-          <w:color w:val="2E74B5" w:themeColor="accent5" w:themeShade="BF"/>
-          <w:shd w:val="clear" w:color="auto" w:fill="FFFFFF"/>
+        <w:t>I co-reviewed this manuscript with one of the reviewers who provided the listed reports. This is part of the Nature Communications initiative to facilitate training in peer review and to provide appropriate recognition for Early Career Researchers who co-review manuscripts.</w:t>
+      </w:r>
+      <w:r>
+        <w:rPr>
+          <w:rFonts w:ascii="Arial" w:hAnsi="Arial" w:cs="Arial"/>
+          <w:i/>
+          <w:iCs/>
+          <w:color w:val="2E74B5" w:themeColor="accent5" w:themeShade="BF"/>
+        </w:rPr>
+        <w:br/>
+      </w:r>
+      <w:r>
+        <w:rPr>
+          <w:rFonts w:ascii="Arial" w:hAnsi="Arial" w:cs="Arial"/>
+          <w:i/>
+          <w:iCs/>
+          <w:color w:val="2E74B5" w:themeColor="accent5" w:themeShade="BF"/>
+        </w:rPr>
+        <w:br/>
+      </w:r>
+      <w:r>
+        <w:rPr>
+          <w:rFonts w:ascii="Arial" w:hAnsi="Arial" w:cs="Arial"/>
+          <w:i/>
+          <w:iCs/>
+          <w:color w:val="2E74B5" w:themeColor="accent5" w:themeShade="BF"/>
+        </w:rPr>
+        <w:br/>
+      </w:r>
+      <w:r>
+        <w:rPr>
+          <w:rFonts w:ascii="Arial" w:hAnsi="Arial" w:cs="Arial"/>
+          <w:i/>
+          <w:iCs/>
+          <w:color w:val="2E74B5" w:themeColor="accent5" w:themeShade="BF"/>
+        </w:rPr>
+        <w:br/>
+      </w:r>
+      <w:r>
+        <w:rPr>
+          <w:rFonts w:ascii="Arial" w:hAnsi="Arial" w:cs="Arial"/>
+          <w:i/>
+          <w:iCs/>
+          <w:color w:val="2E74B5" w:themeColor="accent5" w:themeShade="BF"/>
         </w:rPr>
         <w:lastRenderedPageBreak/>
-        <w:t>provide appropriate recognition for Early Career Researchers who co-review manuscripts.</w:t>
-      </w:r>
-      <w:r>
-        <w:rPr>
-          <w:rFonts w:ascii="Arial" w:hAnsi="Arial" w:cs="Arial"/>
-          <w:i/>
-          <w:iCs/>
-          <w:color w:val="2E74B5" w:themeColor="accent5" w:themeShade="BF"/>
-        </w:rPr>
-        <w:br/>
-      </w:r>
-      <w:r>
-        <w:rPr>
-          <w:rFonts w:ascii="Arial" w:hAnsi="Arial" w:cs="Arial"/>
-          <w:i/>
-          <w:iCs/>
-          <w:color w:val="2E74B5" w:themeColor="accent5" w:themeShade="BF"/>
-        </w:rPr>
-        <w:br/>
-      </w:r>
-      <w:r>
-        <w:rPr>
-          <w:rFonts w:ascii="Arial" w:hAnsi="Arial" w:cs="Arial"/>
-          <w:i/>
-          <w:iCs/>
-          <w:color w:val="2E74B5" w:themeColor="accent5" w:themeShade="BF"/>
-        </w:rPr>
-        <w:br/>
-      </w:r>
-      <w:r>
-        <w:rPr>
-          <w:rFonts w:ascii="Arial" w:hAnsi="Arial" w:cs="Arial"/>
-          <w:i/>
-          <w:iCs/>
-          <w:color w:val="2E74B5" w:themeColor="accent5" w:themeShade="BF"/>
-        </w:rPr>
-        <w:br/>
-      </w:r>
-      <w:r>
-        <w:rPr>
-          <w:rFonts w:ascii="Arial" w:hAnsi="Arial" w:cs="Arial"/>
-          <w:i/>
-          <w:iCs/>
-          <w:color w:val="2E74B5" w:themeColor="accent5" w:themeShade="BF"/>
-        </w:rPr>
         <w:br/>
       </w:r>
       <w:r>
@@ -2507,18 +2909,7 @@
           <w:color w:val="2E74B5" w:themeColor="accent5" w:themeShade="BF"/>
           <w:shd w:val="clear" w:color="auto" w:fill="FFFFFF"/>
         </w:rPr>
-        <w:t xml:space="preserve">. Because most antibiotics (including ampicillin in this case) primarily kill actively growing cells and do so more slowly when growth is reduced, it is expected that cells in the first phase of the killing curve (i.e., predominantly short-term tolerant cells) will take longer to die and will also display </w:t>
-      </w:r>
-      <w:r>
-        <w:rPr>
-          <w:rFonts w:ascii="Arial" w:hAnsi="Arial" w:cs="Arial"/>
-          <w:i/>
-          <w:iCs/>
-          <w:color w:val="2E74B5" w:themeColor="accent5" w:themeShade="BF"/>
-          <w:shd w:val="clear" w:color="auto" w:fill="FFFFFF"/>
-        </w:rPr>
-        <w:lastRenderedPageBreak/>
-        <w:t xml:space="preserve">longer lag times upon recovery. Thus, the observation that slower-growing cells exhibit extended lag times is not, on its own, </w:t>
+        <w:t xml:space="preserve">. Because most antibiotics (including ampicillin in this case) primarily kill actively growing cells and do so more slowly when growth is reduced, it is expected that cells in the first phase of the killing curve (i.e., predominantly short-term tolerant cells) will take longer to die and will also display longer lag times upon recovery. Thus, the observation that slower-growing cells exhibit extended lag times is not, on its own, </w:t>
       </w:r>
       <w:commentRangeStart w:id="8"/>
       <w:r>
@@ -2581,7 +2972,19 @@
           <w:highlight w:val="yellow"/>
           <w:shd w:val="clear" w:color="auto" w:fill="FFFFFF"/>
         </w:rPr>
-        <w:t xml:space="preserve">supplementary data showing a biphasic killing curve for the overall population are still required to substantiate the persister claim in the present manuscript. If such data exist, they should be included explicitly and </w:t>
+        <w:t xml:space="preserve">supplementary data showing a biphasic </w:t>
+      </w:r>
+      <w:r>
+        <w:rPr>
+          <w:rFonts w:ascii="Arial" w:hAnsi="Arial" w:cs="Arial"/>
+          <w:i/>
+          <w:iCs/>
+          <w:color w:val="2E74B5" w:themeColor="accent5" w:themeShade="BF"/>
+          <w:highlight w:val="yellow"/>
+          <w:shd w:val="clear" w:color="auto" w:fill="FFFFFF"/>
+        </w:rPr>
+        <w:lastRenderedPageBreak/>
+        <w:t xml:space="preserve">killing curve for the overall population are still required to substantiate the persister claim in the present manuscript. If such data exist, they should be included explicitly and </w:t>
       </w:r>
       <w:commentRangeStart w:id="9"/>
       <w:r>
@@ -3034,7 +3437,35 @@
           <w:color w:val="2E74B5" w:themeColor="accent5" w:themeShade="BF"/>
           <w:shd w:val="clear" w:color="auto" w:fill="FFFFFF"/>
         </w:rPr>
-        <w:t xml:space="preserve">level, nor whether serine hydroxamate enters all cells simultaneously. tRNA abundance and charging states are known to fluctuate among individual cells, contributing to single-cell variability in translation efficiency, growth rate, and stress responses. Although no study, to my knowledge, has directly measured tRNA levels at single-cell resolution to demonstrate large differences among genetically identical cells, such heterogeneity is frequently inferred </w:t>
+        <w:t>level, nor whether serine hydroxamate enters all cells simultaneously. tRNA abundance and charging states are known to fluctuate among individual cells, contributing to single-cell variability in translation efficiency, growth rate, and stress responses. Although no study, to my knowledge, has directly measured tRNA levels at single-cell resolution to demonstrate large differences among genetically identical cells, such heterogeneity is frequently inferred from population-level analyses (e.g., DOI: 10.1126/science.1141967).</w:t>
+      </w:r>
+      <w:r>
+        <w:rPr>
+          <w:rFonts w:ascii="Arial" w:hAnsi="Arial" w:cs="Arial"/>
+          <w:i/>
+          <w:iCs/>
+          <w:color w:val="2E74B5" w:themeColor="accent5" w:themeShade="BF"/>
+        </w:rPr>
+        <w:br/>
+      </w:r>
+      <w:r>
+        <w:rPr>
+          <w:rFonts w:ascii="Arial" w:hAnsi="Arial" w:cs="Arial"/>
+          <w:i/>
+          <w:iCs/>
+          <w:color w:val="2E74B5" w:themeColor="accent5" w:themeShade="BF"/>
+        </w:rPr>
+        <w:br/>
+      </w:r>
+      <w:r>
+        <w:rPr>
+          <w:rFonts w:ascii="Arial" w:hAnsi="Arial" w:cs="Arial"/>
+          <w:i/>
+          <w:iCs/>
+          <w:color w:val="2E74B5" w:themeColor="accent5" w:themeShade="BF"/>
+          <w:shd w:val="clear" w:color="auto" w:fill="FFFFFF"/>
+        </w:rPr>
+        <w:t xml:space="preserve">Regardless of whether tRNA heterogeneity is the dominant source of variation, the use of serine hydroxamate introduces an exogenous chemical whose uptake and intracellular </w:t>
       </w:r>
       <w:r>
         <w:rPr>
@@ -3045,35 +3476,7 @@
           <w:shd w:val="clear" w:color="auto" w:fill="FFFFFF"/>
         </w:rPr>
         <w:lastRenderedPageBreak/>
-        <w:t>from population-level analyses (e.g., DOI: 10.1126/science.1141967).</w:t>
-      </w:r>
-      <w:r>
-        <w:rPr>
-          <w:rFonts w:ascii="Arial" w:hAnsi="Arial" w:cs="Arial"/>
-          <w:i/>
-          <w:iCs/>
-          <w:color w:val="2E74B5" w:themeColor="accent5" w:themeShade="BF"/>
-        </w:rPr>
-        <w:br/>
-      </w:r>
-      <w:r>
-        <w:rPr>
-          <w:rFonts w:ascii="Arial" w:hAnsi="Arial" w:cs="Arial"/>
-          <w:i/>
-          <w:iCs/>
-          <w:color w:val="2E74B5" w:themeColor="accent5" w:themeShade="BF"/>
-        </w:rPr>
-        <w:br/>
-      </w:r>
-      <w:r>
-        <w:rPr>
-          <w:rFonts w:ascii="Arial" w:hAnsi="Arial" w:cs="Arial"/>
-          <w:i/>
-          <w:iCs/>
-          <w:color w:val="2E74B5" w:themeColor="accent5" w:themeShade="BF"/>
-          <w:shd w:val="clear" w:color="auto" w:fill="FFFFFF"/>
-        </w:rPr>
-        <w:t>Regardless of whether tRNA heterogeneity is the dominant source of variation, the use of serine hydroxamate introduces an exogenous chemical whose uptake and intracellular concentration may vary between cells, owing to differences in envelope permeability, transport, or metabolic state. As a result, some of the observed heterogeneity may reflect variability in drug uptake or action rather than intrinsic regulatory dysregulation. In addition, the observed effects may be specific to serine limitation, rather than reflecting a generalizable response to nutrient stress, and this distinction is not addressed in the manuscript.</w:t>
+        <w:t>concentration may vary between cells, owing to differences in envelope permeability, transport, or metabolic state. As a result, some of the observed heterogeneity may reflect variability in drug uptake or action rather than intrinsic regulatory dysregulation. In addition, the observed effects may be specific to serine limitation, rather than reflecting a generalizable response to nutrient stress, and this distinction is not addressed in the manuscript.</w:t>
       </w:r>
       <w:r>
         <w:rPr>
@@ -3351,7 +3754,25 @@
           <w:color w:val="2E74B5" w:themeColor="accent5" w:themeShade="BF"/>
           <w:shd w:val="clear" w:color="auto" w:fill="FFFFFF"/>
         </w:rPr>
-        <w:t xml:space="preserve">. Dis-Arrest cells were pretreated with serine hydroxamate, analogous to experimental strategies that use bacteriostatic pretreatments to enrich for persister populations (although whether such treatments generate bona fide persisters remains debated). In contrast, Reg-Arrest cells were not treated with serine hydroxamate, resulting in a control that does not match the experimental condition. If stationary-phase Reg-Arrest cells </w:t>
+        <w:t>. Dis-Arrest cells were pretreated with serine hydroxamate, analogous to experimental strategies that use bacteriostatic pretreatments to enrich for persister populations (although whether such treatments generate bona fide persisters remains debated). In contrast, Reg-Arrest cells were not treated with serine hydroxamate, resulting in a control that does not match the experimental condition. If stationary-phase Reg-Arrest cells are truly amino-acid starved, particularly for serine, then serine hydroxamate treatment should have little effect. Conversely, if serine hydroxamate does alter the Reg-Arrest phenotype, this would suggest that additional mechanisms are at play.</w:t>
+      </w:r>
+      <w:r>
+        <w:rPr>
+          <w:rFonts w:ascii="Arial" w:hAnsi="Arial" w:cs="Arial"/>
+          <w:i/>
+          <w:iCs/>
+          <w:color w:val="2E74B5" w:themeColor="accent5" w:themeShade="BF"/>
+        </w:rPr>
+        <w:br/>
+      </w:r>
+      <w:r>
+        <w:rPr>
+          <w:rFonts w:ascii="Arial" w:hAnsi="Arial" w:cs="Arial"/>
+          <w:i/>
+          <w:iCs/>
+          <w:color w:val="2E74B5" w:themeColor="accent5" w:themeShade="BF"/>
+        </w:rPr>
+        <w:br/>
       </w:r>
       <w:r>
         <w:rPr>
@@ -3362,34 +3783,6 @@
           <w:shd w:val="clear" w:color="auto" w:fill="FFFFFF"/>
         </w:rPr>
         <w:lastRenderedPageBreak/>
-        <w:t>are truly amino-acid starved, particularly for serine, then serine hydroxamate treatment should have little effect. Conversely, if serine hydroxamate does alter the Reg-Arrest phenotype, this would suggest that additional mechanisms are at play.</w:t>
-      </w:r>
-      <w:r>
-        <w:rPr>
-          <w:rFonts w:ascii="Arial" w:hAnsi="Arial" w:cs="Arial"/>
-          <w:i/>
-          <w:iCs/>
-          <w:color w:val="2E74B5" w:themeColor="accent5" w:themeShade="BF"/>
-        </w:rPr>
-        <w:br/>
-      </w:r>
-      <w:r>
-        <w:rPr>
-          <w:rFonts w:ascii="Arial" w:hAnsi="Arial" w:cs="Arial"/>
-          <w:i/>
-          <w:iCs/>
-          <w:color w:val="2E74B5" w:themeColor="accent5" w:themeShade="BF"/>
-        </w:rPr>
-        <w:br/>
-      </w:r>
-      <w:r>
-        <w:rPr>
-          <w:rFonts w:ascii="Arial" w:hAnsi="Arial" w:cs="Arial"/>
-          <w:i/>
-          <w:iCs/>
-          <w:color w:val="2E74B5" w:themeColor="accent5" w:themeShade="BF"/>
-          <w:shd w:val="clear" w:color="auto" w:fill="FFFFFF"/>
-        </w:rPr>
         <w:t xml:space="preserve">Critical details regarding the Reg-Arrest condition are missing. </w:t>
       </w:r>
       <w:commentRangeStart w:id="17"/>
@@ -3805,8 +4198,18 @@
           <w:color w:val="2E74B5" w:themeColor="accent5" w:themeShade="BF"/>
           <w:shd w:val="clear" w:color="auto" w:fill="FFFFFF"/>
         </w:rPr>
+        <w:t xml:space="preserve">Notably, the Discussion states: “This seemingly unfavorable condition…can actually lead to increased survival, due to the prolonged growth-arrested state, when a lethal antibiotic treatment targeting growth is applied.” This assertion is inconsistent with the SDS results, as SDS damages cell membranes, and persisters are typically more (not less) resilient to such </w:t>
+      </w:r>
+      <w:r>
+        <w:rPr>
+          <w:rFonts w:ascii="Arial" w:hAnsi="Arial" w:cs="Arial"/>
+          <w:i/>
+          <w:iCs/>
+          <w:color w:val="2E74B5" w:themeColor="accent5" w:themeShade="BF"/>
+          <w:shd w:val="clear" w:color="auto" w:fill="FFFFFF"/>
+        </w:rPr>
         <w:lastRenderedPageBreak/>
-        <w:t>Notably, the Discussion states: “This seemingly unfavorable condition…can actually lead to increased survival, due to the prolonged growth-arrested state, when a lethal antibiotic treatment targeting growth is applied.” This assertion is inconsistent with the SDS results, as SDS damages cell membranes, and persisters are typically more (not less) resilient to such stressors. The SDS data, therefore, provide evidence against the interpretation that Dis-Arrest cells become persisters. This contradiction is not addressed in the manuscript, nor are additional experiments presented to reconcile SDS sensitivity with the proposed persistence model.</w:t>
+        <w:t>stressors. The SDS data, therefore, provide evidence against the interpretation that Dis-Arrest cells become persisters. This contradiction is not addressed in the manuscript, nor are additional experiments presented to reconcile SDS sensitivity with the proposed persistence model.</w:t>
       </w:r>
       <w:r>
         <w:rPr>
@@ -4096,18 +4499,7 @@
           <w:color w:val="2E74B5" w:themeColor="accent5" w:themeShade="BF"/>
           <w:shd w:val="clear" w:color="auto" w:fill="FFFFFF"/>
         </w:rPr>
-        <w:t>Solid and liquid growth environments impose fundamentally different physiological states: colonies growing on solid media behave as surface-</w:t>
-      </w:r>
-      <w:r>
-        <w:rPr>
-          <w:rFonts w:ascii="Arial" w:hAnsi="Arial" w:cs="Arial"/>
-          <w:i/>
-          <w:iCs/>
-          <w:color w:val="2E74B5" w:themeColor="accent5" w:themeShade="BF"/>
-          <w:shd w:val="clear" w:color="auto" w:fill="FFFFFF"/>
-        </w:rPr>
-        <w:lastRenderedPageBreak/>
-        <w:t>associated, biofilm communities,</w:t>
+        <w:t>Solid and liquid growth environments impose fundamentally different physiological states: colonies growing on solid media behave as surface-associated, biofilm communities,</w:t>
       </w:r>
       <w:commentRangeEnd w:id="26"/>
       <w:r>
@@ -4149,6 +4541,7 @@
           <w:iCs/>
           <w:color w:val="2E74B5" w:themeColor="accent5" w:themeShade="BF"/>
         </w:rPr>
+        <w:lastRenderedPageBreak/>
         <w:br/>
       </w:r>
       <w:r>
@@ -4481,7 +4874,7 @@
           <w:color w:val="2E74B5" w:themeColor="accent5" w:themeShade="BF"/>
           <w:shd w:val="clear" w:color="auto" w:fill="FFFFFF"/>
         </w:rPr>
-        <w:t xml:space="preserve">The manuscript does not explain why this strain was selected, nor does it discuss the </w:t>
+        <w:t xml:space="preserve">The manuscript does not explain why this strain was selected, nor does it discuss the potential biases introduced by using a strain with an impaired stringent response. In particular, it remains unclear how the observed variability compares to that of a typical E. coli strain with a fully functional stringent response. Without such justification or comparison, it is difficult to determine whether the reported effects arise from the experimental perturbations </w:t>
       </w:r>
       <w:r>
         <w:rPr>
@@ -4492,7 +4885,7 @@
           <w:shd w:val="clear" w:color="auto" w:fill="FFFFFF"/>
         </w:rPr>
         <w:lastRenderedPageBreak/>
-        <w:t>potential biases introduced by using a strain with an impaired stringent response. In particular, it remains unclear how the observed variability compares to that of a typical E. coli strain with a fully functional stringent response. Without such justification or comparison, it is difficult to determine whether the reported effects arise from the experimental perturbations or from the underlying genetic background of the strain itself.</w:t>
+        <w:t>or from the underlying genetic background of the strain itself.</w:t>
       </w:r>
       <w:r>
         <w:rPr>
@@ -4745,7 +5138,7 @@
           <w:color w:val="2E74B5" w:themeColor="accent5" w:themeShade="BF"/>
           <w:shd w:val="clear" w:color="auto" w:fill="FFFFFF"/>
         </w:rPr>
-        <w:t xml:space="preserve">In this manuscript, Gutfreund and colleagues investigate disrupted growth-arrest using single cell RNA-seq and a newly developed measure of gene-gene expression correlation in sparse data. In the first section, they develop a measure, GMP-cor, based on the eigenvalue </w:t>
+        <w:t xml:space="preserve">In this manuscript, Gutfreund and colleagues investigate disrupted growth-arrest using single cell RNA-seq and a newly developed measure of gene-gene expression correlation in sparse data. In the first section, they develop a measure, GMP-cor, based on the eigenvalue density of the correlation matrix. This can be compared to the eigenvalue density of scrambled data, providing a measure of overall correlation while compensating for the sparsity of scRNA-seq data. Looking at three scRNA-seq data sets (exponential growth, regulated growth-arrest (reg-arrest), and disrupted growth-arrest (dis-arrest)), cells grown in </w:t>
       </w:r>
       <w:r>
         <w:rPr>
@@ -4756,7 +5149,7 @@
           <w:shd w:val="clear" w:color="auto" w:fill="FFFFFF"/>
         </w:rPr>
         <w:lastRenderedPageBreak/>
-        <w:t>density of the correlation matrix. This can be compared to the eigenvalue density of scrambled data, providing a measure of overall correlation while compensating for the sparsity of scRNA-seq data. Looking at three scRNA-seq data sets (exponential growth, regulated growth-arrest (reg-arrest), and disrupted growth-arrest (dis-arrest)), cells grown in the dis-arrest condition exhibit a loss of correlation in their gene expression patterns. They show that the (lack of) coherence of expression patterns is also reflected in bulk RNA-seq data by a loss of gene set enrichment in the dis-arrest condition relative to reg-arrest. Finally, they apply their measure to a scRNA-seq time course following induction of a toxin (VapC) known to induce antibiotic tolerance and persistence, showing that their GMP-cor measure also indicates a loss of gene-gene expression correlation in this data, suggesting it is a general property of the cellular state underlying tolerance/persistence.</w:t>
+        <w:t>the dis-arrest condition exhibit a loss of correlation in their gene expression patterns. They show that the (lack of) coherence of expression patterns is also reflected in bulk RNA-seq data by a loss of gene set enrichment in the dis-arrest condition relative to reg-arrest. Finally, they apply their measure to a scRNA-seq time course following induction of a toxin (VapC) known to induce antibiotic tolerance and persistence, showing that their GMP-cor measure also indicates a loss of gene-gene expression correlation in this data, suggesting it is a general property of the cellular state underlying tolerance/persistence.</w:t>
       </w:r>
       <w:r>
         <w:rPr>

</xml_diff>

<commit_message>
response to reviewer 4
</commit_message>
<xml_diff>
--- a/documents/Rebuttal02032026.docx
+++ b/documents/Rebuttal02032026.docx
@@ -374,67 +374,7 @@
         <w:rPr>
           <w:bCs/>
         </w:rPr>
-        <w:t>. The addition of this simulation has vastly improved our understanding of the correlation eigenval</w:t>
-      </w:r>
-      <w:r>
-        <w:rPr>
-          <w:bCs/>
-          <w:noProof/>
-        </w:rPr>
-        <w:drawing>
-          <wp:inline distT="0" distB="0" distL="0" distR="0" wp14:anchorId="215E6C77" wp14:editId="7CF19129">
-            <wp:extent cx="4572000" cy="3657600"/>
-            <wp:effectExtent l="0" t="0" r="0" b="0"/>
-            <wp:docPr id="1337461186" name="Picture 1"/>
-            <wp:cNvGraphicFramePr>
-              <a:graphicFrameLocks xmlns:a="http://schemas.openxmlformats.org/drawingml/2006/main" noChangeAspect="1"/>
-            </wp:cNvGraphicFramePr>
-            <a:graphic xmlns:a="http://schemas.openxmlformats.org/drawingml/2006/main">
-              <a:graphicData uri="http://schemas.openxmlformats.org/drawingml/2006/picture">
-                <pic:pic xmlns:pic="http://schemas.openxmlformats.org/drawingml/2006/picture">
-                  <pic:nvPicPr>
-                    <pic:cNvPr id="0" name="Picture 1"/>
-                    <pic:cNvPicPr>
-                      <a:picLocks noChangeAspect="1" noChangeArrowheads="1"/>
-                    </pic:cNvPicPr>
-                  </pic:nvPicPr>
-                  <pic:blipFill>
-                    <a:blip r:embed="rId8">
-                      <a:extLst>
-                        <a:ext uri="{28A0092B-C50C-407E-A947-70E740481C1C}">
-                          <a14:useLocalDpi xmlns:a14="http://schemas.microsoft.com/office/drawing/2010/main" val="0"/>
-                        </a:ext>
-                      </a:extLst>
-                    </a:blip>
-                    <a:srcRect/>
-                    <a:stretch>
-                      <a:fillRect/>
-                    </a:stretch>
-                  </pic:blipFill>
-                  <pic:spPr bwMode="auto">
-                    <a:xfrm>
-                      <a:off x="0" y="0"/>
-                      <a:ext cx="4572000" cy="3657600"/>
-                    </a:xfrm>
-                    <a:prstGeom prst="rect">
-                      <a:avLst/>
-                    </a:prstGeom>
-                    <a:noFill/>
-                    <a:ln>
-                      <a:noFill/>
-                    </a:ln>
-                  </pic:spPr>
-                </pic:pic>
-              </a:graphicData>
-            </a:graphic>
-          </wp:inline>
-        </w:drawing>
-      </w:r>
-      <w:r>
-        <w:rPr>
-          <w:bCs/>
-        </w:rPr>
-        <w:t>ue analysis and helped us refine the GMP-Cor metric, to better reflect true correlations while considering also the structure and sparsity of the data.</w:t>
+        <w:t>. The addition of this simulation has vastly improved our understanding of the correlation eigenvalue analysis and helped us refine the GMP-Cor metric, to better reflect true correlations while considering also the structure and sparsity of the data.</w:t>
       </w:r>
       <w:r>
         <w:rPr>
@@ -479,14 +419,7 @@
         <w:rPr>
           <w:b/>
         </w:rPr>
-        <w:t xml:space="preserve">genuine </w:t>
-      </w:r>
-      <w:r>
-        <w:rPr>
-          <w:b/>
-        </w:rPr>
-        <w:lastRenderedPageBreak/>
-        <w:t>coupling strength rather than sampling noise</w:t>
+        <w:t>genuine coupling strength rather than sampling noise</w:t>
       </w:r>
       <w:r>
         <w:rPr>
@@ -624,7 +557,11 @@
         <w:t>appear</w:t>
       </w:r>
       <w:r>
-        <w:t xml:space="preserve"> as dysregulation, we simulated two sub-populations of 500 cells each with distinct hub-network topologies (different covariance seeds) combined into one matrix, and compared a regulated mixture (both ρ = 0.8) against a dysregulated mixture (both ρ = 0.1):</w:t>
+        <w:t xml:space="preserve"> as dysregulation, we simulated two sub-populations of 500 cells each with distinct hub-network topologies (different covariance seeds) combined into one matrix, and compared a regulated </w:t>
+      </w:r>
+      <w:r>
+        <w:lastRenderedPageBreak/>
+        <w:t>mixture (both ρ = 0.8) against a dysregulated mixture (both ρ = 0.1):</w:t>
       </w:r>
       <w:r>
         <w:rPr>
@@ -911,15 +848,7 @@
           <w:b/>
           <w:bCs/>
         </w:rPr>
-        <w:t xml:space="preserve"> interpretation that the Dis-Arrest signal is an </w:t>
-      </w:r>
-      <w:r>
-        <w:rPr>
-          <w:b/>
-          <w:bCs/>
-        </w:rPr>
-        <w:lastRenderedPageBreak/>
-        <w:t>artifact of population heterogeneity</w:t>
+        <w:t xml:space="preserve"> interpretation that the Dis-Arrest signal is an artifact of population heterogeneity</w:t>
       </w:r>
       <w:r>
         <w:t xml:space="preserve">. </w:t>
@@ -1140,7 +1069,14 @@
         <w:rPr>
           <w:bCs/>
         </w:rPr>
-        <w:t>computed on the full set of cells passing quality control for each condition</w:t>
+        <w:t xml:space="preserve">computed on the full set of cells </w:t>
+      </w:r>
+      <w:r>
+        <w:rPr>
+          <w:bCs/>
+        </w:rPr>
+        <w:lastRenderedPageBreak/>
+        <w:t>passing quality control for each condition</w:t>
       </w:r>
       <w:r>
         <w:rPr>
@@ -2658,125 +2594,17 @@
         <w:t>, which presents the main conclusion of this chapter.</w:t>
       </w:r>
       <w:r>
-        <w:t xml:space="preserve"> Nevertheless, as the reviewer pointed out, it is important to check that there is no bias based on the gene-set size of the GO terms. To address this, we tested the correlation between the enrichment score difference and the gene-set size in each GO terms. </w:t>
-      </w:r>
-      <w:r>
-        <w:t>Across the 20 terms significant in both</w:t>
-      </w:r>
-      <w:r>
-        <w:t xml:space="preserve"> </w:t>
-      </w:r>
-      <w:r>
-        <w:t xml:space="preserve">conditions, </w:t>
+        <w:t xml:space="preserve"> Nevertheless, as the reviewer pointed out, it is important to check that there is no bias based on the gene-set size of the GO terms. To address this, we tested the correlation between the enrichment score difference and the gene-set size in each GO terms. Across the 20 terms significant in both conditions, </w:t>
       </w:r>
       <w:r>
         <w:rPr>
           <w:b/>
           <w:bCs/>
         </w:rPr>
-        <w:t xml:space="preserve">the signed difference in </w:t>
-      </w:r>
-      <w:r>
-        <w:rPr>
-          <w:b/>
-          <w:bCs/>
-        </w:rPr>
-        <w:t>enrichment score</w:t>
-      </w:r>
-      <w:r>
-        <w:rPr>
-          <w:b/>
-          <w:bCs/>
-        </w:rPr>
-        <w:t xml:space="preserve"> between Reg-</w:t>
-      </w:r>
-      <w:r>
-        <w:rPr>
-          <w:b/>
-          <w:bCs/>
-        </w:rPr>
-        <w:t>Arrest</w:t>
-      </w:r>
-      <w:r>
-        <w:rPr>
-          <w:b/>
-          <w:bCs/>
-        </w:rPr>
-        <w:t xml:space="preserve"> and Dis-Arrest shows no</w:t>
-      </w:r>
-      <w:r>
-        <w:rPr>
-          <w:b/>
-          <w:bCs/>
-        </w:rPr>
-        <w:t xml:space="preserve"> </w:t>
-      </w:r>
-      <w:r>
-        <w:rPr>
-          <w:b/>
-          <w:bCs/>
-        </w:rPr>
-        <w:t>significant dependence on gene-set size (Spearman ρ = 0.30, p = 0.2)</w:t>
-      </w:r>
-      <w:r>
-        <w:t xml:space="preserve"> </w:t>
-      </w:r>
-      <w:r>
-        <w:t>-</w:t>
-      </w:r>
-      <w:r>
-        <w:t xml:space="preserve"> i.e., the direction</w:t>
-      </w:r>
-      <w:r>
-        <w:t xml:space="preserve"> </w:t>
-      </w:r>
-      <w:r>
-        <w:t>of the effect (stronger, more coherent enrichment in Reg-Arrest) is independent of how</w:t>
-      </w:r>
-      <w:r>
-        <w:t xml:space="preserve"> </w:t>
-      </w:r>
-      <w:r>
-        <w:t>many genes a term contains. The absolute magnitude of the difference does increase mildly</w:t>
-      </w:r>
-      <w:r>
-        <w:t xml:space="preserve"> </w:t>
-      </w:r>
-      <w:r>
-        <w:t xml:space="preserve">with gene-set </w:t>
-      </w:r>
-      <w:r>
-        <w:t>size (</w:t>
-      </w:r>
-      <w:r>
-        <w:t>Spearman ρ = 0.53, p = 0.017), but this is an expected statistical</w:t>
-      </w:r>
-      <w:r>
-        <w:t xml:space="preserve"> </w:t>
-      </w:r>
-      <w:r>
-        <w:t xml:space="preserve">property of any </w:t>
-      </w:r>
-      <w:r>
-        <w:t>FDR related metric</w:t>
-      </w:r>
-      <w:r>
-        <w:t>: larger gene sets can reach smaller FDRs and</w:t>
-      </w:r>
-      <w:r>
-        <w:t xml:space="preserve"> </w:t>
-      </w:r>
-      <w:r>
-        <w:t>therefore span a wider dynamic range, so differences appear larger. It does not reflect a size-specific bias in the biological conclusion</w:t>
-      </w:r>
-      <w:r>
-        <w:t xml:space="preserve"> </w:t>
-      </w:r>
-      <w:r>
-        <w:t>(new Supplementary Fig. [S3</w:t>
-      </w:r>
-      <w:r>
-        <w:t>]).</w:t>
+        <w:t>the signed difference in enrichment score between Reg-Arrest and Dis-Arrest shows no significant dependence on gene-set size (Spearman ρ = 0.30, p = 0.2)</w:t>
+      </w:r>
+      <w:r>
+        <w:t xml:space="preserve"> - i.e., the direction of the effect (stronger, more coherent enrichment in Reg-Arrest) is independent of how many genes a term contains.</w:t>
       </w:r>
     </w:p>
     <w:p>
@@ -2880,7 +2708,7 @@
           <w:color w:val="2E74B5" w:themeColor="accent5" w:themeShade="BF"/>
           <w:shd w:val="clear" w:color="auto" w:fill="FFFFFF"/>
         </w:rPr>
-        <w:t xml:space="preserve"> Specifically, is the “Dis-</w:t>
+        <w:t xml:space="preserve"> Specifically, is the “Dis-arrest” state defined primarily by the long-lag phenotype or by the correlation index? If the latter, does this imply that a prolonged lag time alone does not necessarily lead to transcriptional dysregulation, and therefore may not be sufficient to drive persistence? Because the manuscript suggests a connection between the Dis-arrest–like state, prolonged </w:t>
       </w:r>
       <w:r>
         <w:rPr>
@@ -2891,7 +2719,7 @@
           <w:shd w:val="clear" w:color="auto" w:fill="FFFFFF"/>
         </w:rPr>
         <w:lastRenderedPageBreak/>
-        <w:t xml:space="preserve">arrest” state defined primarily by the long-lag phenotype or by the correlation index? If the latter, does this imply that a prolonged lag time alone does not necessarily lead to transcriptional dysregulation, and therefore may not be sufficient to drive persistence? Because the manuscript suggests a connection between the Dis-arrest–like state, prolonged lag times, and persistence, </w:t>
+        <w:t xml:space="preserve">lag times, and persistence, </w:t>
       </w:r>
       <w:r>
         <w:rPr>
@@ -2974,7 +2802,7 @@
         <w:t>main goal</w:t>
       </w:r>
       <w:r>
-        <w:t xml:space="preserve"> line of this work. </w:t>
+        <w:t xml:space="preserve"> of this work. </w:t>
       </w:r>
       <w:r>
         <w:t xml:space="preserve">The connection between long lag times and Dis-Arrest to persistence was already established in previous works (Kaplan et. al., </w:t>
@@ -3000,19 +2828,7 @@
         <w:t>2026).</w:t>
       </w:r>
       <w:r>
-        <w:t xml:space="preserve"> </w:t>
-      </w:r>
-      <w:r>
-        <w:t>Undoubtfully, including a direct persistence assay</w:t>
-      </w:r>
-      <w:r>
-        <w:t xml:space="preserve"> in this study</w:t>
-      </w:r>
-      <w:r>
-        <w:t xml:space="preserve"> would have made</w:t>
-      </w:r>
-      <w:r>
-        <w:t xml:space="preserve"> this connection much clearer - we</w:t>
+        <w:t xml:space="preserve"> Undoubtfully, including a direct persistence assay in this study would have made this connection much clearer - we</w:t>
       </w:r>
       <w:r>
         <w:rPr>
@@ -3151,6 +2967,7 @@
           <w:i/>
           <w:iCs/>
           <w:color w:val="2E74B5" w:themeColor="accent5" w:themeShade="BF"/>
+          <w:shd w:val="clear" w:color="auto" w:fill="FFFFFF"/>
         </w:rPr>
       </w:pPr>
       <w:r>
@@ -3290,43 +3107,43 @@
           <w:iCs/>
           <w:color w:val="2E74B5" w:themeColor="accent5" w:themeShade="BF"/>
         </w:rPr>
+        <w:br/>
+      </w:r>
+      <w:r>
+        <w:rPr>
+          <w:rFonts w:ascii="Arial" w:hAnsi="Arial" w:cs="Arial"/>
+          <w:i/>
+          <w:iCs/>
+          <w:color w:val="2E74B5" w:themeColor="accent5" w:themeShade="BF"/>
+        </w:rPr>
+        <w:br/>
+      </w:r>
+      <w:r>
+        <w:rPr>
+          <w:rFonts w:ascii="Arial" w:hAnsi="Arial" w:cs="Arial"/>
+          <w:i/>
+          <w:iCs/>
+          <w:color w:val="2E74B5" w:themeColor="accent5" w:themeShade="BF"/>
+        </w:rPr>
+        <w:br/>
+      </w:r>
+      <w:r>
+        <w:rPr>
+          <w:rFonts w:ascii="Arial" w:hAnsi="Arial" w:cs="Arial"/>
+          <w:i/>
+          <w:iCs/>
+          <w:color w:val="2E74B5" w:themeColor="accent5" w:themeShade="BF"/>
+        </w:rPr>
+        <w:br/>
+      </w:r>
+      <w:r>
+        <w:rPr>
+          <w:rFonts w:ascii="Arial" w:hAnsi="Arial" w:cs="Arial"/>
+          <w:i/>
+          <w:iCs/>
+          <w:color w:val="2E74B5" w:themeColor="accent5" w:themeShade="BF"/>
+        </w:rPr>
         <w:lastRenderedPageBreak/>
-        <w:br/>
-      </w:r>
-      <w:r>
-        <w:rPr>
-          <w:rFonts w:ascii="Arial" w:hAnsi="Arial" w:cs="Arial"/>
-          <w:i/>
-          <w:iCs/>
-          <w:color w:val="2E74B5" w:themeColor="accent5" w:themeShade="BF"/>
-        </w:rPr>
-        <w:br/>
-      </w:r>
-      <w:r>
-        <w:rPr>
-          <w:rFonts w:ascii="Arial" w:hAnsi="Arial" w:cs="Arial"/>
-          <w:i/>
-          <w:iCs/>
-          <w:color w:val="2E74B5" w:themeColor="accent5" w:themeShade="BF"/>
-        </w:rPr>
-        <w:br/>
-      </w:r>
-      <w:r>
-        <w:rPr>
-          <w:rFonts w:ascii="Arial" w:hAnsi="Arial" w:cs="Arial"/>
-          <w:i/>
-          <w:iCs/>
-          <w:color w:val="2E74B5" w:themeColor="accent5" w:themeShade="BF"/>
-        </w:rPr>
-        <w:br/>
-      </w:r>
-      <w:r>
-        <w:rPr>
-          <w:rFonts w:ascii="Arial" w:hAnsi="Arial" w:cs="Arial"/>
-          <w:i/>
-          <w:iCs/>
-          <w:color w:val="2E74B5" w:themeColor="accent5" w:themeShade="BF"/>
-        </w:rPr>
         <w:br/>
       </w:r>
       <w:r>
@@ -3575,7 +3392,6 @@
           <w:iCs/>
           <w:color w:val="2E74B5" w:themeColor="accent5" w:themeShade="BF"/>
         </w:rPr>
-        <w:lastRenderedPageBreak/>
         <w:br/>
       </w:r>
       <w:r>
@@ -3624,6 +3440,7 @@
           <w:highlight w:val="yellow"/>
           <w:shd w:val="clear" w:color="auto" w:fill="FFFFFF"/>
         </w:rPr>
+        <w:lastRenderedPageBreak/>
         <w:commentReference w:id="9"/>
       </w:r>
       <w:r>
@@ -4078,8 +3895,18 @@
           <w:color w:val="2E74B5" w:themeColor="accent5" w:themeShade="BF"/>
           <w:shd w:val="clear" w:color="auto" w:fill="FFFFFF"/>
         </w:rPr>
+        <w:t xml:space="preserve">Regardless of whether tRNA heterogeneity is the dominant source of variation, the use of serine hydroxamate introduces an exogenous chemical whose uptake and intracellular concentration may vary between cells, owing to differences in envelope permeability, transport, or metabolic state. As a result, some of the observed heterogeneity may reflect </w:t>
+      </w:r>
+      <w:r>
+        <w:rPr>
+          <w:rFonts w:ascii="Arial" w:hAnsi="Arial" w:cs="Arial"/>
+          <w:i/>
+          <w:iCs/>
+          <w:color w:val="2E74B5" w:themeColor="accent5" w:themeShade="BF"/>
+          <w:shd w:val="clear" w:color="auto" w:fill="FFFFFF"/>
+        </w:rPr>
         <w:lastRenderedPageBreak/>
-        <w:t>Regardless of whether tRNA heterogeneity is the dominant source of variation, the use of serine hydroxamate introduces an exogenous chemical whose uptake and intracellular concentration may vary between cells, owing to differences in envelope permeability, transport, or metabolic state. As a result, some of the observed heterogeneity may reflect variability in drug uptake or action rather than intrinsic regulatory dysregulation. In addition, the observed effects may be specific to serine limitation, rather than reflecting a generalizable response to nutrient stress, and this distinction is not addressed in the manuscript.</w:t>
+        <w:t>variability in drug uptake or action rather than intrinsic regulatory dysregulation. In addition, the observed effects may be specific to serine limitation, rather than reflecting a generalizable response to nutrient stress, and this distinction is not addressed in the manuscript.</w:t>
       </w:r>
       <w:r>
         <w:rPr>
@@ -4357,18 +4184,7 @@
           <w:color w:val="2E74B5" w:themeColor="accent5" w:themeShade="BF"/>
           <w:shd w:val="clear" w:color="auto" w:fill="FFFFFF"/>
         </w:rPr>
-        <w:t xml:space="preserve">. Dis-Arrest cells were pretreated with serine hydroxamate, analogous to experimental strategies that use bacteriostatic pretreatments to enrich for persister populations (although whether such treatments generate bona fide persisters remains debated). In contrast, Reg-Arrest cells were not treated with serine hydroxamate, resulting in a control that does not match the experimental condition. If stationary-phase Reg-Arrest cells are truly amino-acid starved, particularly for serine, then serine hydroxamate treatment should have little effect. Conversely, if serine hydroxamate does alter the Reg-Arrest </w:t>
-      </w:r>
-      <w:r>
-        <w:rPr>
-          <w:rFonts w:ascii="Arial" w:hAnsi="Arial" w:cs="Arial"/>
-          <w:i/>
-          <w:iCs/>
-          <w:color w:val="2E74B5" w:themeColor="accent5" w:themeShade="BF"/>
-          <w:shd w:val="clear" w:color="auto" w:fill="FFFFFF"/>
-        </w:rPr>
-        <w:lastRenderedPageBreak/>
-        <w:t>phenotype, this would suggest that additional mechanisms are at play.</w:t>
+        <w:t>. Dis-Arrest cells were pretreated with serine hydroxamate, analogous to experimental strategies that use bacteriostatic pretreatments to enrich for persister populations (although whether such treatments generate bona fide persisters remains debated). In contrast, Reg-Arrest cells were not treated with serine hydroxamate, resulting in a control that does not match the experimental condition. If stationary-phase Reg-Arrest cells are truly amino-acid starved, particularly for serine, then serine hydroxamate treatment should have little effect. Conversely, if serine hydroxamate does alter the Reg-Arrest phenotype, this would suggest that additional mechanisms are at play.</w:t>
       </w:r>
       <w:r>
         <w:rPr>
@@ -4432,7 +4248,18 @@
           <w:color w:val="2E74B5" w:themeColor="accent5" w:themeShade="BF"/>
           <w:shd w:val="clear" w:color="auto" w:fill="FFFFFF"/>
         </w:rPr>
-        <w:t>. Because cultures can enter stationary phase at different times and undergo substantial physiological changes the longer they remain in stationary phase. This information is essential for interpreting the results and for ensuring reproducibility.</w:t>
+        <w:t xml:space="preserve">. Because cultures can </w:t>
+      </w:r>
+      <w:r>
+        <w:rPr>
+          <w:rFonts w:ascii="Arial" w:hAnsi="Arial" w:cs="Arial"/>
+          <w:i/>
+          <w:iCs/>
+          <w:color w:val="2E74B5" w:themeColor="accent5" w:themeShade="BF"/>
+          <w:shd w:val="clear" w:color="auto" w:fill="FFFFFF"/>
+        </w:rPr>
+        <w:lastRenderedPageBreak/>
+        <w:t>enter stationary phase at different times and undergo substantial physiological changes the longer they remain in stationary phase. This information is essential for interpreting the results and for ensuring reproducibility.</w:t>
       </w:r>
       <w:r>
         <w:rPr>
@@ -4811,7 +4638,7 @@
           <w:color w:val="2E74B5" w:themeColor="accent5" w:themeShade="BF"/>
           <w:shd w:val="clear" w:color="auto" w:fill="FFFFFF"/>
         </w:rPr>
-        <w:t xml:space="preserve">Notably, the Discussion states: “This seemingly unfavorable condition…can actually lead to increased survival, due to the prolonged growth-arrested state, when a lethal antibiotic </w:t>
+        <w:t xml:space="preserve">Notably, the Discussion states: “This seemingly unfavorable condition…can actually lead to increased survival, due to the prolonged growth-arrested state, when a lethal antibiotic treatment targeting growth is applied.” This assertion is inconsistent with the SDS results, as SDS damages cell membranes, and persisters are typically more (not less) resilient to such stressors. The SDS data, therefore, provide evidence against the interpretation that Dis-Arrest cells become persisters. This contradiction is not addressed in the manuscript, nor are </w:t>
       </w:r>
       <w:r>
         <w:rPr>
@@ -4822,7 +4649,7 @@
           <w:shd w:val="clear" w:color="auto" w:fill="FFFFFF"/>
         </w:rPr>
         <w:lastRenderedPageBreak/>
-        <w:t>treatment targeting growth is applied.” This assertion is inconsistent with the SDS results, as SDS damages cell membranes, and persisters are typically more (not less) resilient to such stressors. The SDS data, therefore, provide evidence against the interpretation that Dis-Arrest cells become persisters. This contradiction is not addressed in the manuscript, nor are additional experiments presented to reconcile SDS sensitivity with the proposed persistence model.</w:t>
+        <w:t>additional experiments presented to reconcile SDS sensitivity with the proposed persistence model.</w:t>
       </w:r>
       <w:r>
         <w:rPr>
@@ -5136,7 +4963,44 @@
           <w:color w:val="2E74B5" w:themeColor="accent5" w:themeShade="BF"/>
           <w:shd w:val="clear" w:color="auto" w:fill="FFFFFF"/>
         </w:rPr>
-        <w:t xml:space="preserve"> whereas laboratory E. coli is typically maintained in planktonic growth in liquid culture. Consequently, lag times measured on solid media may </w:t>
+        <w:t xml:space="preserve"> whereas laboratory E. coli is typically maintained in planktonic growth in liquid culture. Consequently, lag times measured on solid media may not accurately reflect the physiological state of cells grown and harvested from liquid cultures.</w:t>
+      </w:r>
+      <w:r>
+        <w:rPr>
+          <w:rFonts w:ascii="Arial" w:hAnsi="Arial" w:cs="Arial"/>
+          <w:i/>
+          <w:iCs/>
+          <w:color w:val="2E74B5" w:themeColor="accent5" w:themeShade="BF"/>
+        </w:rPr>
+        <w:br/>
+      </w:r>
+      <w:r>
+        <w:rPr>
+          <w:rFonts w:ascii="Arial" w:hAnsi="Arial" w:cs="Arial"/>
+          <w:i/>
+          <w:iCs/>
+          <w:color w:val="2E74B5" w:themeColor="accent5" w:themeShade="BF"/>
+        </w:rPr>
+        <w:br/>
+      </w:r>
+      <w:r>
+        <w:rPr>
+          <w:rFonts w:ascii="Arial" w:hAnsi="Arial" w:cs="Arial"/>
+          <w:i/>
+          <w:iCs/>
+          <w:color w:val="2E74B5" w:themeColor="accent5" w:themeShade="BF"/>
+          <w:shd w:val="clear" w:color="auto" w:fill="FFFFFF"/>
+        </w:rPr>
+        <w:t>9. Abstract Does Not Reflect the Nature of the Work</w:t>
+      </w:r>
+      <w:r>
+        <w:rPr>
+          <w:rFonts w:ascii="Arial" w:hAnsi="Arial" w:cs="Arial"/>
+          <w:i/>
+          <w:iCs/>
+          <w:color w:val="2E74B5" w:themeColor="accent5" w:themeShade="BF"/>
+        </w:rPr>
+        <w:br/>
       </w:r>
       <w:r>
         <w:rPr>
@@ -5147,53 +5011,6 @@
           <w:shd w:val="clear" w:color="auto" w:fill="FFFFFF"/>
         </w:rPr>
         <w:lastRenderedPageBreak/>
-        <w:t>not accurately reflect the physiological state of cells grown and harvested from liquid cultures.</w:t>
-      </w:r>
-      <w:r>
-        <w:rPr>
-          <w:rFonts w:ascii="Arial" w:hAnsi="Arial" w:cs="Arial"/>
-          <w:i/>
-          <w:iCs/>
-          <w:color w:val="2E74B5" w:themeColor="accent5" w:themeShade="BF"/>
-        </w:rPr>
-        <w:br/>
-      </w:r>
-      <w:r>
-        <w:rPr>
-          <w:rFonts w:ascii="Arial" w:hAnsi="Arial" w:cs="Arial"/>
-          <w:i/>
-          <w:iCs/>
-          <w:color w:val="2E74B5" w:themeColor="accent5" w:themeShade="BF"/>
-        </w:rPr>
-        <w:br/>
-      </w:r>
-      <w:r>
-        <w:rPr>
-          <w:rFonts w:ascii="Arial" w:hAnsi="Arial" w:cs="Arial"/>
-          <w:i/>
-          <w:iCs/>
-          <w:color w:val="2E74B5" w:themeColor="accent5" w:themeShade="BF"/>
-          <w:shd w:val="clear" w:color="auto" w:fill="FFFFFF"/>
-        </w:rPr>
-        <w:t>9. Abstract Does Not Reflect the Nature of the Work</w:t>
-      </w:r>
-      <w:r>
-        <w:rPr>
-          <w:rFonts w:ascii="Arial" w:hAnsi="Arial" w:cs="Arial"/>
-          <w:i/>
-          <w:iCs/>
-          <w:color w:val="2E74B5" w:themeColor="accent5" w:themeShade="BF"/>
-        </w:rPr>
-        <w:br/>
-      </w:r>
-      <w:r>
-        <w:rPr>
-          <w:rFonts w:ascii="Arial" w:hAnsi="Arial" w:cs="Arial"/>
-          <w:i/>
-          <w:iCs/>
-          <w:color w:val="2E74B5" w:themeColor="accent5" w:themeShade="BF"/>
-          <w:shd w:val="clear" w:color="auto" w:fill="FFFFFF"/>
-        </w:rPr>
         <w:t>While the abstract emphasizes antibiotic tolerance, persistence, and dysregulation, the majority of the manuscript is devoted to the development and evaluation of the GMP-Cor metric as a quantitative tool. As written, the study reads more like a methods-focused paper than a mechanistic investigation of antibiotic persistence. The abstract should therefore be revised to reflect this emphasis, as the evidence supporting persistence-related claims is currently insufficient.</w:t>
       </w:r>
       <w:r>
@@ -5497,7 +5314,25 @@
           <w:color w:val="2E74B5" w:themeColor="accent5" w:themeShade="BF"/>
           <w:shd w:val="clear" w:color="auto" w:fill="FFFFFF"/>
         </w:rPr>
-        <w:t xml:space="preserve">The manuscript does not explain why this strain was selected, nor does it discuss the potential biases introduced by using a strain with an impaired stringent response. In particular, it remains unclear how the observed variability compares to that of a typical E. coli </w:t>
+        <w:t>The manuscript does not explain why this strain was selected, nor does it discuss the potential biases introduced by using a strain with an impaired stringent response. In particular, it remains unclear how the observed variability compares to that of a typical E. coli strain with a fully functional stringent response. Without such justification or comparison, it is difficult to determine whether the reported effects arise from the experimental perturbations or from the underlying genetic background of the strain itself.</w:t>
+      </w:r>
+      <w:r>
+        <w:rPr>
+          <w:rFonts w:ascii="Arial" w:hAnsi="Arial" w:cs="Arial"/>
+          <w:i/>
+          <w:iCs/>
+          <w:color w:val="2E74B5" w:themeColor="accent5" w:themeShade="BF"/>
+        </w:rPr>
+        <w:br/>
+      </w:r>
+      <w:r>
+        <w:rPr>
+          <w:rFonts w:ascii="Arial" w:hAnsi="Arial" w:cs="Arial"/>
+          <w:i/>
+          <w:iCs/>
+          <w:color w:val="2E74B5" w:themeColor="accent5" w:themeShade="BF"/>
+        </w:rPr>
+        <w:br/>
       </w:r>
       <w:r>
         <w:rPr>
@@ -5508,34 +5343,6 @@
           <w:shd w:val="clear" w:color="auto" w:fill="FFFFFF"/>
         </w:rPr>
         <w:lastRenderedPageBreak/>
-        <w:t>strain with a fully functional stringent response. Without such justification or comparison, it is difficult to determine whether the reported effects arise from the experimental perturbations or from the underlying genetic background of the strain itself.</w:t>
-      </w:r>
-      <w:r>
-        <w:rPr>
-          <w:rFonts w:ascii="Arial" w:hAnsi="Arial" w:cs="Arial"/>
-          <w:i/>
-          <w:iCs/>
-          <w:color w:val="2E74B5" w:themeColor="accent5" w:themeShade="BF"/>
-        </w:rPr>
-        <w:br/>
-      </w:r>
-      <w:r>
-        <w:rPr>
-          <w:rFonts w:ascii="Arial" w:hAnsi="Arial" w:cs="Arial"/>
-          <w:i/>
-          <w:iCs/>
-          <w:color w:val="2E74B5" w:themeColor="accent5" w:themeShade="BF"/>
-        </w:rPr>
-        <w:br/>
-      </w:r>
-      <w:r>
-        <w:rPr>
-          <w:rFonts w:ascii="Arial" w:hAnsi="Arial" w:cs="Arial"/>
-          <w:i/>
-          <w:iCs/>
-          <w:color w:val="2E74B5" w:themeColor="accent5" w:themeShade="BF"/>
-          <w:shd w:val="clear" w:color="auto" w:fill="FFFFFF"/>
-        </w:rPr>
         <w:t>Minor Concerns</w:t>
       </w:r>
       <w:r>
@@ -5761,7 +5568,7 @@
           <w:color w:val="2E74B5" w:themeColor="accent5" w:themeShade="BF"/>
           <w:shd w:val="clear" w:color="auto" w:fill="FFFFFF"/>
         </w:rPr>
-        <w:t xml:space="preserve">In this manuscript, Gutfreund and colleagues investigate disrupted growth-arrest using single cell RNA-seq and a newly developed measure of gene-gene expression correlation in sparse data. In the first section, they develop a measure, GMP-cor, based on the eigenvalue density of the correlation matrix. This can be compared to the eigenvalue density of scrambled data, providing a measure of overall correlation while compensating for the </w:t>
+        <w:t xml:space="preserve">In this manuscript, Gutfreund and colleagues investigate disrupted growth-arrest using single cell RNA-seq and a newly developed measure of gene-gene expression correlation in sparse data. In the first section, they develop a measure, GMP-cor, based on the eigenvalue density of the correlation matrix. This can be compared to the eigenvalue density of scrambled data, providing a measure of overall correlation while compensating for the sparsity of scRNA-seq data. Looking at three scRNA-seq data sets (exponential growth, regulated growth-arrest (reg-arrest), and disrupted growth-arrest (dis-arrest)), cells grown in the dis-arrest condition exhibit a loss of correlation in their gene expression patterns. They show that the (lack of) coherence of expression patterns is also reflected in bulk RNA-seq </w:t>
       </w:r>
       <w:r>
         <w:rPr>
@@ -5772,7 +5579,7 @@
           <w:shd w:val="clear" w:color="auto" w:fill="FFFFFF"/>
         </w:rPr>
         <w:lastRenderedPageBreak/>
-        <w:t>sparsity of scRNA-seq data. Looking at three scRNA-seq data sets (exponential growth, regulated growth-arrest (reg-arrest), and disrupted growth-arrest (dis-arrest)), cells grown in the dis-arrest condition exhibit a loss of correlation in their gene expression patterns. They show that the (lack of) coherence of expression patterns is also reflected in bulk RNA-seq data by a loss of gene set enrichment in the dis-arrest condition relative to reg-arrest. Finally, they apply their measure to a scRNA-seq time course following induction of a toxin (VapC) known to induce antibiotic tolerance and persistence, showing that their GMP-cor measure also indicates a loss of gene-gene expression correlation in this data, suggesting it is a general property of the cellular state underlying tolerance/persistence.</w:t>
+        <w:t>data by a loss of gene set enrichment in the dis-arrest condition relative to reg-arrest. Finally, they apply their measure to a scRNA-seq time course following induction of a toxin (VapC) known to induce antibiotic tolerance and persistence, showing that their GMP-cor measure also indicates a loss of gene-gene expression correlation in this data, suggesting it is a general property of the cellular state underlying tolerance/persistence.</w:t>
       </w:r>
       <w:r>
         <w:rPr>
@@ -5841,6 +5648,15 @@
         </w:rPr>
         <w:t>could you get back to gene information by looking in more detail (at the eigenvectors associated with unusually large eigenvalues?), maybe in comparison to e.g. a theoretical compendium of non-dis-arrest conditions?</w:t>
       </w:r>
+    </w:p>
+    <w:p>
+      <w:pPr>
+        <w:rPr>
+          <w:rFonts w:ascii="Segoe UI" w:hAnsi="Segoe UI" w:cs="Segoe UI"/>
+          <w:color w:val="1F2328"/>
+          <w:shd w:val="clear" w:color="auto" w:fill="FFFFFF"/>
+        </w:rPr>
+      </w:pPr>
       <w:commentRangeStart w:id="29"/>
       <w:r>
         <w:rPr>
@@ -5855,17 +5671,897 @@
       <w:r>
         <w:rPr>
           <w:rStyle w:val="CommentReference"/>
-          <w:rFonts w:ascii="Arial" w:hAnsi="Arial" w:cs="Arial"/>
-          <w:i/>
-          <w:iCs/>
-          <w:color w:val="2E74B5" w:themeColor="accent5" w:themeShade="BF"/>
+          <w:rFonts w:ascii="Segoe UI" w:hAnsi="Segoe UI" w:cs="Segoe UI"/>
+          <w:color w:val="1F2328"/>
           <w:sz w:val="22"/>
           <w:szCs w:val="22"/>
+          <w:shd w:val="clear" w:color="auto" w:fill="FFFFFF"/>
         </w:rPr>
         <w:commentReference w:id="29"/>
       </w:r>
       <w:r>
         <w:rPr>
+          <w:rFonts w:ascii="Segoe UI" w:hAnsi="Segoe UI" w:cs="Segoe UI"/>
+          <w:color w:val="1F2328"/>
+          <w:shd w:val="clear" w:color="auto" w:fill="FFFFFF"/>
+        </w:rPr>
+        <w:t>We thank the reviewer for this thoughtful question, which we investigated directly.</w:t>
+      </w:r>
+    </w:p>
+    <w:p>
+      <w:pPr>
+        <w:rPr>
+          <w:rFonts w:ascii="Segoe UI" w:hAnsi="Segoe UI" w:cs="Segoe UI"/>
+          <w:color w:val="1F2328"/>
+          <w:shd w:val="clear" w:color="auto" w:fill="FFFFFF"/>
+        </w:rPr>
+      </w:pPr>
+      <w:r>
+        <w:rPr>
+          <w:rFonts w:ascii="Segoe UI" w:hAnsi="Segoe UI" w:cs="Segoe UI"/>
+          <w:color w:val="1F2328"/>
+          <w:shd w:val="clear" w:color="auto" w:fill="FFFFFF"/>
+        </w:rPr>
+        <w:t xml:space="preserve">For each condition we computed the eigenvectors of the gene–gene correlation matrix, not only the eigenvalues. Individual eigenvectors are, however, not well defined when eigenvalues are near-degenerate: within a (near-)degenerate subspace any orthonormal rotation is an equally valid eigenbasis, so the gene ranking of any single mode is arbitrary and unstable. We therefore summarized the coordinated structure in a </w:t>
+      </w:r>
+      <w:r>
+        <w:rPr>
+          <w:rFonts w:ascii="Segoe UI" w:hAnsi="Segoe UI" w:cs="Segoe UI"/>
+          <w:color w:val="1F2328"/>
+          <w:shd w:val="clear" w:color="auto" w:fill="FFFFFF"/>
+        </w:rPr>
+        <w:t>different</w:t>
+      </w:r>
+      <w:r>
+        <w:rPr>
+          <w:rFonts w:ascii="Segoe UI" w:hAnsi="Segoe UI" w:cs="Segoe UI"/>
+          <w:color w:val="1F2328"/>
+          <w:shd w:val="clear" w:color="auto" w:fill="FFFFFF"/>
+        </w:rPr>
+        <w:t xml:space="preserve"> way. For every gene i we computed a coordination score, the diagonal of the de-noised correlation matrix reconstructed from all modes that exceed the scrambled threshold,</w:t>
+      </w:r>
+    </w:p>
+    <w:p>
+      <w:pPr>
+        <w:rPr>
+          <w:rFonts w:ascii="Segoe UI" w:hAnsi="Segoe UI" w:cs="Segoe UI"/>
+          <w:color w:val="1F2328"/>
+          <w:shd w:val="clear" w:color="auto" w:fill="FFFFFF"/>
+        </w:rPr>
+      </w:pPr>
+      <m:oMathPara>
+        <m:oMath>
+          <m:r>
+            <w:rPr>
+              <w:rFonts w:ascii="Cambria Math" w:hAnsi="Cambria Math" w:cs="Segoe UI"/>
+              <w:color w:val="1F2328"/>
+              <w:shd w:val="clear" w:color="auto" w:fill="FFFFFF"/>
+            </w:rPr>
+            <m:t>scor</m:t>
+          </m:r>
+          <m:sSub>
+            <m:sSubPr>
+              <m:ctrlPr>
+                <w:rPr>
+                  <w:rFonts w:ascii="Cambria Math" w:hAnsi="Cambria Math" w:cs="Segoe UI"/>
+                  <w:color w:val="1F2328"/>
+                  <w:shd w:val="clear" w:color="auto" w:fill="FFFFFF"/>
+                </w:rPr>
+              </m:ctrlPr>
+            </m:sSubPr>
+            <m:e>
+              <m:r>
+                <w:rPr>
+                  <w:rFonts w:ascii="Cambria Math" w:hAnsi="Cambria Math" w:cs="Segoe UI"/>
+                  <w:color w:val="1F2328"/>
+                  <w:shd w:val="clear" w:color="auto" w:fill="FFFFFF"/>
+                </w:rPr>
+                <m:t>e</m:t>
+              </m:r>
+            </m:e>
+            <m:sub>
+              <m:r>
+                <w:rPr>
+                  <w:rFonts w:ascii="Cambria Math" w:hAnsi="Cambria Math" w:cs="Segoe UI"/>
+                  <w:color w:val="1F2328"/>
+                  <w:shd w:val="clear" w:color="auto" w:fill="FFFFFF"/>
+                </w:rPr>
+                <m:t>i</m:t>
+              </m:r>
+            </m:sub>
+          </m:sSub>
+          <m:r>
+            <m:rPr>
+              <m:sty m:val="p"/>
+            </m:rPr>
+            <w:rPr>
+              <w:rFonts w:ascii="Cambria Math" w:hAnsi="Cambria Math" w:cs="Segoe UI"/>
+              <w:color w:val="1F2328"/>
+              <w:shd w:val="clear" w:color="auto" w:fill="FFFFFF"/>
+            </w:rPr>
+            <m:t>=</m:t>
+          </m:r>
+          <m:nary>
+            <m:naryPr>
+              <m:chr m:val="∑"/>
+              <m:supHide m:val="1"/>
+              <m:ctrlPr>
+                <w:rPr>
+                  <w:rFonts w:ascii="Cambria Math" w:hAnsi="Cambria Math" w:cs="Segoe UI"/>
+                  <w:color w:val="1F2328"/>
+                  <w:shd w:val="clear" w:color="auto" w:fill="FFFFFF"/>
+                </w:rPr>
+              </m:ctrlPr>
+            </m:naryPr>
+            <m:sub>
+              <m:sSub>
+                <m:sSubPr>
+                  <m:ctrlPr>
+                    <w:rPr>
+                      <w:rFonts w:ascii="Cambria Math" w:hAnsi="Cambria Math" w:cs="Segoe UI"/>
+                      <w:color w:val="1F2328"/>
+                      <w:shd w:val="clear" w:color="auto" w:fill="FFFFFF"/>
+                    </w:rPr>
+                  </m:ctrlPr>
+                </m:sSubPr>
+                <m:e>
+                  <m:r>
+                    <w:rPr>
+                      <w:rFonts w:ascii="Cambria Math" w:hAnsi="Cambria Math" w:cs="Segoe UI"/>
+                      <w:color w:val="1F2328"/>
+                      <w:shd w:val="clear" w:color="auto" w:fill="FFFFFF"/>
+                    </w:rPr>
+                    <m:t>λ</m:t>
+                  </m:r>
+                </m:e>
+                <m:sub>
+                  <m:r>
+                    <w:rPr>
+                      <w:rFonts w:ascii="Cambria Math" w:hAnsi="Cambria Math" w:cs="Segoe UI"/>
+                      <w:color w:val="1F2328"/>
+                      <w:shd w:val="clear" w:color="auto" w:fill="FFFFFF"/>
+                    </w:rPr>
+                    <m:t>k</m:t>
+                  </m:r>
+                </m:sub>
+              </m:sSub>
+              <m:r>
+                <m:rPr>
+                  <m:sty m:val="p"/>
+                </m:rPr>
+                <w:rPr>
+                  <w:rFonts w:ascii="Cambria Math" w:hAnsi="Cambria Math" w:cs="Segoe UI"/>
+                  <w:color w:val="1F2328"/>
+                  <w:shd w:val="clear" w:color="auto" w:fill="FFFFFF"/>
+                </w:rPr>
+                <m:t>&gt;</m:t>
+              </m:r>
+              <m:sSubSup>
+                <m:sSubSupPr>
+                  <m:ctrlPr>
+                    <w:rPr>
+                      <w:rFonts w:ascii="Cambria Math" w:hAnsi="Cambria Math" w:cs="Segoe UI"/>
+                      <w:color w:val="1F2328"/>
+                      <w:shd w:val="clear" w:color="auto" w:fill="FFFFFF"/>
+                    </w:rPr>
+                  </m:ctrlPr>
+                </m:sSubSupPr>
+                <m:e>
+                  <m:r>
+                    <w:rPr>
+                      <w:rFonts w:ascii="Cambria Math" w:hAnsi="Cambria Math" w:cs="Segoe UI"/>
+                      <w:color w:val="1F2328"/>
+                      <w:shd w:val="clear" w:color="auto" w:fill="FFFFFF"/>
+                    </w:rPr>
+                    <m:t>λ</m:t>
+                  </m:r>
+                </m:e>
+                <m:sub>
+                  <m:r>
+                    <w:rPr>
+                      <w:rFonts w:ascii="Cambria Math" w:hAnsi="Cambria Math" w:cs="Segoe UI"/>
+                      <w:color w:val="1F2328"/>
+                      <w:shd w:val="clear" w:color="auto" w:fill="FFFFFF"/>
+                    </w:rPr>
+                    <m:t>max</m:t>
+                  </m:r>
+                </m:sub>
+                <m:sup>
+                  <m:r>
+                    <w:rPr>
+                      <w:rFonts w:ascii="Cambria Math" w:hAnsi="Cambria Math" w:cs="Segoe UI"/>
+                      <w:color w:val="1F2328"/>
+                      <w:shd w:val="clear" w:color="auto" w:fill="FFFFFF"/>
+                    </w:rPr>
+                    <m:t>scr</m:t>
+                  </m:r>
+                </m:sup>
+              </m:sSubSup>
+            </m:sub>
+            <m:sup/>
+            <m:e>
+              <m:r>
+                <m:rPr>
+                  <m:sty m:val="p"/>
+                </m:rPr>
+                <w:rPr>
+                  <w:rFonts w:ascii="Cambria Math" w:hAnsi="Cambria Math" w:cs="Segoe UI"/>
+                  <w:color w:val="1F2328"/>
+                  <w:shd w:val="clear" w:color="auto" w:fill="FFFFFF"/>
+                </w:rPr>
+                <m:t>(</m:t>
+              </m:r>
+              <m:sSub>
+                <m:sSubPr>
+                  <m:ctrlPr>
+                    <w:rPr>
+                      <w:rFonts w:ascii="Cambria Math" w:hAnsi="Cambria Math" w:cs="Segoe UI"/>
+                      <w:color w:val="1F2328"/>
+                      <w:shd w:val="clear" w:color="auto" w:fill="FFFFFF"/>
+                    </w:rPr>
+                  </m:ctrlPr>
+                </m:sSubPr>
+                <m:e>
+                  <m:r>
+                    <w:rPr>
+                      <w:rFonts w:ascii="Cambria Math" w:hAnsi="Cambria Math" w:cs="Segoe UI"/>
+                      <w:color w:val="1F2328"/>
+                      <w:shd w:val="clear" w:color="auto" w:fill="FFFFFF"/>
+                    </w:rPr>
+                    <m:t>λ</m:t>
+                  </m:r>
+                </m:e>
+                <m:sub>
+                  <m:r>
+                    <w:rPr>
+                      <w:rFonts w:ascii="Cambria Math" w:hAnsi="Cambria Math" w:cs="Segoe UI"/>
+                      <w:color w:val="1F2328"/>
+                      <w:shd w:val="clear" w:color="auto" w:fill="FFFFFF"/>
+                    </w:rPr>
+                    <m:t>k</m:t>
+                  </m:r>
+                </m:sub>
+              </m:sSub>
+              <m:r>
+                <m:rPr>
+                  <m:sty m:val="p"/>
+                </m:rPr>
+                <w:rPr>
+                  <w:rFonts w:ascii="Cambria Math" w:hAnsi="Cambria Math" w:cs="Segoe UI"/>
+                  <w:color w:val="1F2328"/>
+                  <w:shd w:val="clear" w:color="auto" w:fill="FFFFFF"/>
+                </w:rPr>
+                <m:t>-</m:t>
+              </m:r>
+            </m:e>
+          </m:nary>
+          <m:sSubSup>
+            <m:sSubSupPr>
+              <m:ctrlPr>
+                <w:rPr>
+                  <w:rFonts w:ascii="Cambria Math" w:hAnsi="Cambria Math" w:cs="Segoe UI"/>
+                  <w:color w:val="1F2328"/>
+                  <w:shd w:val="clear" w:color="auto" w:fill="FFFFFF"/>
+                </w:rPr>
+              </m:ctrlPr>
+            </m:sSubSupPr>
+            <m:e>
+              <m:r>
+                <w:rPr>
+                  <w:rFonts w:ascii="Cambria Math" w:hAnsi="Cambria Math" w:cs="Segoe UI"/>
+                  <w:color w:val="1F2328"/>
+                  <w:shd w:val="clear" w:color="auto" w:fill="FFFFFF"/>
+                </w:rPr>
+                <m:t>λ</m:t>
+              </m:r>
+            </m:e>
+            <m:sub>
+              <m:r>
+                <w:rPr>
+                  <w:rFonts w:ascii="Cambria Math" w:hAnsi="Cambria Math" w:cs="Segoe UI"/>
+                  <w:color w:val="1F2328"/>
+                  <w:shd w:val="clear" w:color="auto" w:fill="FFFFFF"/>
+                </w:rPr>
+                <m:t>max</m:t>
+              </m:r>
+            </m:sub>
+            <m:sup>
+              <m:r>
+                <w:rPr>
+                  <w:rFonts w:ascii="Cambria Math" w:hAnsi="Cambria Math" w:cs="Segoe UI"/>
+                  <w:color w:val="1F2328"/>
+                  <w:shd w:val="clear" w:color="auto" w:fill="FFFFFF"/>
+                </w:rPr>
+                <m:t>scr</m:t>
+              </m:r>
+            </m:sup>
+          </m:sSubSup>
+          <m:r>
+            <m:rPr>
+              <m:sty m:val="p"/>
+            </m:rPr>
+            <w:rPr>
+              <w:rFonts w:ascii="Cambria Math" w:hAnsi="Cambria Math" w:cs="Segoe UI"/>
+              <w:color w:val="1F2328"/>
+              <w:shd w:val="clear" w:color="auto" w:fill="FFFFFF"/>
+            </w:rPr>
+            <m:t>)</m:t>
+          </m:r>
+          <m:sSubSup>
+            <m:sSubSupPr>
+              <m:ctrlPr>
+                <w:rPr>
+                  <w:rFonts w:ascii="Cambria Math" w:hAnsi="Cambria Math" w:cs="Segoe UI"/>
+                  <w:color w:val="1F2328"/>
+                  <w:shd w:val="clear" w:color="auto" w:fill="FFFFFF"/>
+                </w:rPr>
+              </m:ctrlPr>
+            </m:sSubSupPr>
+            <m:e>
+              <m:r>
+                <w:rPr>
+                  <w:rFonts w:ascii="Cambria Math" w:hAnsi="Cambria Math" w:cs="Segoe UI"/>
+                  <w:color w:val="1F2328"/>
+                  <w:shd w:val="clear" w:color="auto" w:fill="FFFFFF"/>
+                </w:rPr>
+                <m:t>v</m:t>
+              </m:r>
+            </m:e>
+            <m:sub>
+              <m:r>
+                <w:rPr>
+                  <w:rFonts w:ascii="Cambria Math" w:hAnsi="Cambria Math" w:cs="Segoe UI"/>
+                  <w:color w:val="1F2328"/>
+                  <w:shd w:val="clear" w:color="auto" w:fill="FFFFFF"/>
+                </w:rPr>
+                <m:t>k</m:t>
+              </m:r>
+              <m:r>
+                <m:rPr>
+                  <m:sty m:val="p"/>
+                </m:rPr>
+                <w:rPr>
+                  <w:rFonts w:ascii="Cambria Math" w:hAnsi="Cambria Math" w:cs="Segoe UI"/>
+                  <w:color w:val="1F2328"/>
+                  <w:shd w:val="clear" w:color="auto" w:fill="FFFFFF"/>
+                </w:rPr>
+                <m:t>,</m:t>
+              </m:r>
+              <m:r>
+                <w:rPr>
+                  <w:rFonts w:ascii="Cambria Math" w:hAnsi="Cambria Math" w:cs="Segoe UI"/>
+                  <w:color w:val="1F2328"/>
+                  <w:shd w:val="clear" w:color="auto" w:fill="FFFFFF"/>
+                </w:rPr>
+                <m:t>i</m:t>
+              </m:r>
+            </m:sub>
+            <m:sup>
+              <m:r>
+                <m:rPr>
+                  <m:sty m:val="p"/>
+                </m:rPr>
+                <w:rPr>
+                  <w:rFonts w:ascii="Cambria Math" w:hAnsi="Cambria Math" w:cs="Segoe UI"/>
+                  <w:color w:val="1F2328"/>
+                  <w:shd w:val="clear" w:color="auto" w:fill="FFFFFF"/>
+                </w:rPr>
+                <m:t>2</m:t>
+              </m:r>
+            </m:sup>
+          </m:sSubSup>
+        </m:oMath>
+      </m:oMathPara>
+    </w:p>
+    <w:p>
+      <w:pPr>
+        <w:rPr>
+          <w:rFonts w:ascii="Segoe UI" w:hAnsi="Segoe UI" w:cs="Segoe UI"/>
+          <w:color w:val="1F2328"/>
+          <w:shd w:val="clear" w:color="auto" w:fill="FFFFFF"/>
+        </w:rPr>
+      </w:pPr>
+      <w:r>
+        <w:rPr>
+          <w:rFonts w:ascii="Segoe UI" w:hAnsi="Segoe UI" w:cs="Segoe UI"/>
+          <w:color w:val="1F2328"/>
+          <w:shd w:val="clear" w:color="auto" w:fill="FFFFFF"/>
+        </w:rPr>
+        <w:t xml:space="preserve">where </w:t>
+      </w:r>
+      <m:oMath>
+        <m:sSub>
+          <m:sSubPr>
+            <m:ctrlPr>
+              <w:rPr>
+                <w:rFonts w:ascii="Cambria Math" w:hAnsi="Cambria Math" w:cs="Segoe UI"/>
+                <w:color w:val="1F2328"/>
+                <w:shd w:val="clear" w:color="auto" w:fill="FFFFFF"/>
+              </w:rPr>
+            </m:ctrlPr>
+          </m:sSubPr>
+          <m:e>
+            <m:r>
+              <w:rPr>
+                <w:rFonts w:ascii="Cambria Math" w:hAnsi="Cambria Math" w:cs="Segoe UI"/>
+                <w:color w:val="1F2328"/>
+                <w:shd w:val="clear" w:color="auto" w:fill="FFFFFF"/>
+              </w:rPr>
+              <m:t>v</m:t>
+            </m:r>
+          </m:e>
+          <m:sub>
+            <m:r>
+              <w:rPr>
+                <w:rFonts w:ascii="Cambria Math" w:hAnsi="Cambria Math" w:cs="Segoe UI"/>
+                <w:color w:val="1F2328"/>
+                <w:shd w:val="clear" w:color="auto" w:fill="FFFFFF"/>
+              </w:rPr>
+              <m:t>k</m:t>
+            </m:r>
+          </m:sub>
+        </m:sSub>
+      </m:oMath>
+      <w:r>
+        <w:rPr>
+          <w:rFonts w:ascii="Segoe UI" w:hAnsi="Segoe UI" w:cs="Segoe UI"/>
+          <w:color w:val="1F2328"/>
+          <w:shd w:val="clear" w:color="auto" w:fill="FFFFFF"/>
+        </w:rPr>
+        <w:t xml:space="preserve"> is the eigenvector of mode k. This score measures how much above-noise coordinated variance each gene carries. We then ranked genes by this score and ran GO enrichment (the same goatools pipeline used for the bulk analysis) on the top-ranked genes against the full gene-panel background, in every condition.</w:t>
+      </w:r>
+    </w:p>
+    <w:p>
+      <w:pPr>
+        <w:rPr>
+          <w:rFonts w:ascii="Segoe UI" w:hAnsi="Segoe UI" w:cs="Segoe UI"/>
+          <w:color w:val="1F2328"/>
+          <w:shd w:val="clear" w:color="auto" w:fill="FFFFFF"/>
+        </w:rPr>
+      </w:pPr>
+      <w:r>
+        <w:rPr>
+          <w:rFonts w:ascii="Segoe UI" w:hAnsi="Segoe UI" w:cs="Segoe UI"/>
+          <w:color w:val="1F2328"/>
+          <w:shd w:val="clear" w:color="auto" w:fill="FFFFFF"/>
+        </w:rPr>
+        <w:t>Result</w:t>
+      </w:r>
+      <w:r>
+        <w:rPr>
+          <w:rFonts w:ascii="Segoe UI" w:hAnsi="Segoe UI" w:cs="Segoe UI"/>
+          <w:color w:val="1F2328"/>
+          <w:shd w:val="clear" w:color="auto" w:fill="FFFFFF"/>
+        </w:rPr>
+        <w:t>:</w:t>
+      </w:r>
+      <w:r>
+        <w:rPr>
+          <w:rFonts w:ascii="Segoe UI" w:hAnsi="Segoe UI" w:cs="Segoe UI"/>
+          <w:color w:val="1F2328"/>
+          <w:shd w:val="clear" w:color="auto" w:fill="FFFFFF"/>
+        </w:rPr>
+        <w:t xml:space="preserve"> The outcome is informative but, at the level of specific gene programs, largely negative. In most conditions the top-coordination genes do not enrich for any GO term — and this includes the most strongly coordinated (highest-GMP-Cor) regulated samples. The </w:t>
+      </w:r>
+      <w:r>
+        <w:rPr>
+          <w:rFonts w:ascii="Segoe UI" w:hAnsi="Segoe UI" w:cs="Segoe UI"/>
+          <w:color w:val="1F2328"/>
+          <w:shd w:val="clear" w:color="auto" w:fill="FFFFFF"/>
+        </w:rPr>
+        <w:t>only</w:t>
+      </w:r>
+      <w:r>
+        <w:rPr>
+          <w:rFonts w:ascii="Segoe UI" w:hAnsi="Segoe UI" w:cs="Segoe UI"/>
+          <w:color w:val="1F2328"/>
+          <w:shd w:val="clear" w:color="auto" w:fill="FFFFFF"/>
+        </w:rPr>
+        <w:t xml:space="preserve"> program</w:t>
+      </w:r>
+      <w:r>
+        <w:rPr>
+          <w:rFonts w:ascii="Segoe UI" w:hAnsi="Segoe UI" w:cs="Segoe UI"/>
+          <w:color w:val="1F2328"/>
+          <w:shd w:val="clear" w:color="auto" w:fill="FFFFFF"/>
+        </w:rPr>
+        <w:t>s</w:t>
+      </w:r>
+      <w:r>
+        <w:rPr>
+          <w:rFonts w:ascii="Segoe UI" w:hAnsi="Segoe UI" w:cs="Segoe UI"/>
+          <w:color w:val="1F2328"/>
+          <w:shd w:val="clear" w:color="auto" w:fill="FFFFFF"/>
+        </w:rPr>
+        <w:t xml:space="preserve"> that </w:t>
+      </w:r>
+      <w:r>
+        <w:rPr>
+          <w:rFonts w:ascii="Segoe UI" w:hAnsi="Segoe UI" w:cs="Segoe UI"/>
+          <w:color w:val="1F2328"/>
+          <w:shd w:val="clear" w:color="auto" w:fill="FFFFFF"/>
+        </w:rPr>
+        <w:t>are</w:t>
+      </w:r>
+      <w:r>
+        <w:rPr>
+          <w:rFonts w:ascii="Segoe UI" w:hAnsi="Segoe UI" w:cs="Segoe UI"/>
+          <w:color w:val="1F2328"/>
+          <w:shd w:val="clear" w:color="auto" w:fill="FFFFFF"/>
+        </w:rPr>
+        <w:t xml:space="preserve"> recoverable </w:t>
+      </w:r>
+      <w:r>
+        <w:rPr>
+          <w:rFonts w:ascii="Segoe UI" w:hAnsi="Segoe UI" w:cs="Segoe UI"/>
+          <w:color w:val="1F2328"/>
+          <w:shd w:val="clear" w:color="auto" w:fill="FFFFFF"/>
+        </w:rPr>
+        <w:t>are</w:t>
+      </w:r>
+      <w:r>
+        <w:rPr>
+          <w:rFonts w:ascii="Segoe UI" w:hAnsi="Segoe UI" w:cs="Segoe UI"/>
+          <w:color w:val="1F2328"/>
+          <w:shd w:val="clear" w:color="auto" w:fill="FFFFFF"/>
+        </w:rPr>
+        <w:t xml:space="preserve"> the translation / ribosom</w:t>
+      </w:r>
+      <w:r>
+        <w:rPr>
+          <w:rFonts w:ascii="Segoe UI" w:hAnsi="Segoe UI" w:cs="Segoe UI"/>
+          <w:color w:val="1F2328"/>
+          <w:shd w:val="clear" w:color="auto" w:fill="FFFFFF"/>
+        </w:rPr>
+        <w:t>al protein</w:t>
+      </w:r>
+      <w:r>
+        <w:rPr>
+          <w:rFonts w:ascii="Segoe UI" w:hAnsi="Segoe UI" w:cs="Segoe UI"/>
+          <w:color w:val="1F2328"/>
+          <w:shd w:val="clear" w:color="auto" w:fill="FFFFFF"/>
+        </w:rPr>
+        <w:t xml:space="preserve"> module</w:t>
+      </w:r>
+      <w:r>
+        <w:rPr>
+          <w:rFonts w:ascii="Segoe UI" w:hAnsi="Segoe UI" w:cs="Segoe UI"/>
+          <w:color w:val="1F2328"/>
+          <w:shd w:val="clear" w:color="auto" w:fill="FFFFFF"/>
+        </w:rPr>
+        <w:t>s</w:t>
+      </w:r>
+      <w:r>
+        <w:rPr>
+          <w:rFonts w:ascii="Segoe UI" w:hAnsi="Segoe UI" w:cs="Segoe UI"/>
+          <w:color w:val="1F2328"/>
+          <w:shd w:val="clear" w:color="auto" w:fill="FFFFFF"/>
+        </w:rPr>
+        <w:t xml:space="preserve">. Critically, this program appears in both regulated and </w:t>
+      </w:r>
+      <w:r>
+        <w:rPr>
+          <w:rFonts w:ascii="Segoe UI" w:hAnsi="Segoe UI" w:cs="Segoe UI"/>
+          <w:color w:val="1F2328"/>
+          <w:shd w:val="clear" w:color="auto" w:fill="FFFFFF"/>
+        </w:rPr>
+        <w:t>Di</w:t>
+      </w:r>
+      <w:r>
+        <w:rPr>
+          <w:rFonts w:ascii="Segoe UI" w:hAnsi="Segoe UI" w:cs="Segoe UI"/>
+          <w:color w:val="1F2328"/>
+          <w:shd w:val="clear" w:color="auto" w:fill="FFFFFF"/>
+        </w:rPr>
+        <w:t>s-</w:t>
+      </w:r>
+      <w:r>
+        <w:rPr>
+          <w:rFonts w:ascii="Segoe UI" w:hAnsi="Segoe UI" w:cs="Segoe UI"/>
+          <w:color w:val="1F2328"/>
+          <w:shd w:val="clear" w:color="auto" w:fill="FFFFFF"/>
+        </w:rPr>
+        <w:t>A</w:t>
+      </w:r>
+      <w:r>
+        <w:rPr>
+          <w:rFonts w:ascii="Segoe UI" w:hAnsi="Segoe UI" w:cs="Segoe UI"/>
+          <w:color w:val="1F2328"/>
+          <w:shd w:val="clear" w:color="auto" w:fill="FFFFFF"/>
+        </w:rPr>
+        <w:t>rrest samples</w:t>
+      </w:r>
+      <w:r>
+        <w:rPr>
+          <w:rFonts w:ascii="Segoe UI" w:hAnsi="Segoe UI" w:cs="Segoe UI"/>
+          <w:color w:val="1F2328"/>
+          <w:shd w:val="clear" w:color="auto" w:fill="FFFFFF"/>
+        </w:rPr>
+        <w:t>,</w:t>
+      </w:r>
+      <w:r>
+        <w:rPr>
+          <w:rFonts w:ascii="Segoe UI" w:hAnsi="Segoe UI" w:cs="Segoe UI"/>
+          <w:color w:val="1F2328"/>
+          <w:shd w:val="clear" w:color="auto" w:fill="FFFFFF"/>
+        </w:rPr>
+        <w:t xml:space="preserve"> including weakly coordinated </w:t>
+      </w:r>
+      <w:r>
+        <w:rPr>
+          <w:rFonts w:ascii="Segoe UI" w:hAnsi="Segoe UI" w:cs="Segoe UI"/>
+          <w:color w:val="1F2328"/>
+          <w:shd w:val="clear" w:color="auto" w:fill="FFFFFF"/>
+        </w:rPr>
+        <w:t>D</w:t>
+      </w:r>
+      <w:r>
+        <w:rPr>
+          <w:rFonts w:ascii="Segoe UI" w:hAnsi="Segoe UI" w:cs="Segoe UI"/>
+          <w:color w:val="1F2328"/>
+          <w:shd w:val="clear" w:color="auto" w:fill="FFFFFF"/>
+        </w:rPr>
+        <w:t>is-</w:t>
+      </w:r>
+      <w:r>
+        <w:rPr>
+          <w:rFonts w:ascii="Segoe UI" w:hAnsi="Segoe UI" w:cs="Segoe UI"/>
+          <w:color w:val="1F2328"/>
+          <w:shd w:val="clear" w:color="auto" w:fill="FFFFFF"/>
+        </w:rPr>
+        <w:t>Ar</w:t>
+      </w:r>
+      <w:r>
+        <w:rPr>
+          <w:rFonts w:ascii="Segoe UI" w:hAnsi="Segoe UI" w:cs="Segoe UI"/>
+          <w:color w:val="1F2328"/>
+          <w:shd w:val="clear" w:color="auto" w:fill="FFFFFF"/>
+        </w:rPr>
+        <w:t>rest samples</w:t>
+      </w:r>
+      <w:r>
+        <w:rPr>
+          <w:rFonts w:ascii="Segoe UI" w:hAnsi="Segoe UI" w:cs="Segoe UI"/>
+          <w:color w:val="1F2328"/>
+          <w:shd w:val="clear" w:color="auto" w:fill="FFFFFF"/>
+        </w:rPr>
+        <w:t>,</w:t>
+      </w:r>
+      <w:r>
+        <w:rPr>
+          <w:rFonts w:ascii="Segoe UI" w:hAnsi="Segoe UI" w:cs="Segoe UI"/>
+          <w:color w:val="1F2328"/>
+          <w:shd w:val="clear" w:color="auto" w:fill="FFFFFF"/>
+        </w:rPr>
+        <w:t xml:space="preserve"> so it reflects the dominance of the </w:t>
+      </w:r>
+      <w:r>
+        <w:rPr>
+          <w:rFonts w:ascii="Segoe UI" w:hAnsi="Segoe UI" w:cs="Segoe UI"/>
+          <w:color w:val="1F2328"/>
+          <w:shd w:val="clear" w:color="auto" w:fill="FFFFFF"/>
+        </w:rPr>
+        <w:t xml:space="preserve">highly expressed </w:t>
+      </w:r>
+      <w:r>
+        <w:rPr>
+          <w:rFonts w:ascii="Segoe UI" w:hAnsi="Segoe UI" w:cs="Segoe UI"/>
+          <w:color w:val="1F2328"/>
+          <w:shd w:val="clear" w:color="auto" w:fill="FFFFFF"/>
+        </w:rPr>
+        <w:t xml:space="preserve">ribosomal </w:t>
+      </w:r>
+      <w:r>
+        <w:rPr>
+          <w:rFonts w:ascii="Segoe UI" w:hAnsi="Segoe UI" w:cs="Segoe UI"/>
+          <w:color w:val="1F2328"/>
+          <w:shd w:val="clear" w:color="auto" w:fill="FFFFFF"/>
+        </w:rPr>
+        <w:t>genes</w:t>
+      </w:r>
+      <w:r>
+        <w:rPr>
+          <w:rFonts w:ascii="Segoe UI" w:hAnsi="Segoe UI" w:cs="Segoe UI"/>
+          <w:color w:val="1F2328"/>
+          <w:shd w:val="clear" w:color="auto" w:fill="FFFFFF"/>
+        </w:rPr>
+        <w:t xml:space="preserve"> in the leading mode rather than the regulatory state. Consistent with this, when we correlated the per-gene coordination scores across conditions</w:t>
+      </w:r>
+      <w:r>
+        <w:rPr>
+          <w:rFonts w:ascii="Segoe UI" w:hAnsi="Segoe UI" w:cs="Segoe UI"/>
+          <w:color w:val="1F2328"/>
+          <w:shd w:val="clear" w:color="auto" w:fill="FFFFFF"/>
+        </w:rPr>
+        <w:t xml:space="preserve">, </w:t>
+      </w:r>
+      <w:r>
+        <w:rPr>
+          <w:rFonts w:ascii="Segoe UI" w:hAnsi="Segoe UI" w:cs="Segoe UI"/>
+          <w:color w:val="1F2328"/>
+          <w:shd w:val="clear" w:color="auto" w:fill="FFFFFF"/>
+        </w:rPr>
+        <w:t xml:space="preserve">regulated conditions did not share a common coordinated program any more than dis-arrest </w:t>
+      </w:r>
+      <w:r>
+        <w:rPr>
+          <w:rFonts w:ascii="Segoe UI" w:hAnsi="Segoe UI" w:cs="Segoe UI"/>
+          <w:color w:val="1F2328"/>
+          <w:shd w:val="clear" w:color="auto" w:fill="FFFFFF"/>
+        </w:rPr>
+        <w:lastRenderedPageBreak/>
+        <w:t>conditions did (mean Spearman ρ between coordination-score vectors: regulated–regulated 0.19, dis-arrest–dis-arrest 0.39, regulated–dis-arrest 0.28).</w:t>
+      </w:r>
+    </w:p>
+    <w:p>
+      <w:pPr>
+        <w:rPr>
+          <w:rFonts w:ascii="Segoe UI" w:hAnsi="Segoe UI" w:cs="Segoe UI"/>
+          <w:color w:val="1F2328"/>
+          <w:shd w:val="clear" w:color="auto" w:fill="FFFFFF"/>
+        </w:rPr>
+      </w:pPr>
+      <w:r>
+        <w:rPr>
+          <w:rFonts w:ascii="Segoe UI" w:hAnsi="Segoe UI" w:cs="Segoe UI"/>
+          <w:color w:val="1F2328"/>
+          <w:shd w:val="clear" w:color="auto" w:fill="FFFFFF"/>
+        </w:rPr>
+        <w:t>Interpretation</w:t>
+      </w:r>
+      <w:r>
+        <w:rPr>
+          <w:rFonts w:ascii="Segoe UI" w:hAnsi="Segoe UI" w:cs="Segoe UI"/>
+          <w:color w:val="1F2328"/>
+          <w:shd w:val="clear" w:color="auto" w:fill="FFFFFF"/>
+        </w:rPr>
+        <w:t>.</w:t>
+      </w:r>
+      <w:r>
+        <w:rPr>
+          <w:rFonts w:ascii="Segoe UI" w:hAnsi="Segoe UI" w:cs="Segoe UI"/>
+          <w:color w:val="1F2328"/>
+          <w:shd w:val="clear" w:color="auto" w:fill="FFFFFF"/>
+        </w:rPr>
+        <w:t xml:space="preserve"> We read this as a meaningful, and in fact expected, result: GMP-Cor captures a global, distributed property of the gene-correlation network rather than the activity of a small set of specific gene modules. The loss of coordination in Dis-Arrest is spread across many weakly defined modes, which is precisely why a single scalar that integrates </w:t>
+      </w:r>
+      <w:r>
+        <w:rPr>
+          <w:rFonts w:ascii="Segoe UI" w:hAnsi="Segoe UI" w:cs="Segoe UI"/>
+          <w:color w:val="1F2328"/>
+          <w:shd w:val="clear" w:color="auto" w:fill="FFFFFF"/>
+        </w:rPr>
+        <w:t>most of the transcriptome,</w:t>
+      </w:r>
+      <w:r>
+        <w:rPr>
+          <w:rFonts w:ascii="Segoe UI" w:hAnsi="Segoe UI" w:cs="Segoe UI"/>
+          <w:color w:val="1F2328"/>
+          <w:shd w:val="clear" w:color="auto" w:fill="FFFFFF"/>
+        </w:rPr>
+        <w:t xml:space="preserve"> rather than a </w:t>
+      </w:r>
+      <w:r>
+        <w:rPr>
+          <w:rFonts w:ascii="Segoe UI" w:hAnsi="Segoe UI" w:cs="Segoe UI"/>
+          <w:color w:val="1F2328"/>
+          <w:shd w:val="clear" w:color="auto" w:fill="FFFFFF"/>
+        </w:rPr>
+        <w:t xml:space="preserve">list of regulated/dysregulated </w:t>
+      </w:r>
+      <w:r>
+        <w:rPr>
+          <w:rFonts w:ascii="Segoe UI" w:hAnsi="Segoe UI" w:cs="Segoe UI"/>
+          <w:color w:val="1F2328"/>
+          <w:shd w:val="clear" w:color="auto" w:fill="FFFFFF"/>
+        </w:rPr>
+        <w:t>gene</w:t>
+      </w:r>
+      <w:r>
+        <w:rPr>
+          <w:rFonts w:ascii="Segoe UI" w:hAnsi="Segoe UI" w:cs="Segoe UI"/>
+          <w:color w:val="1F2328"/>
+          <w:shd w:val="clear" w:color="auto" w:fill="FFFFFF"/>
+        </w:rPr>
+        <w:t>s,</w:t>
+      </w:r>
+      <w:r>
+        <w:rPr>
+          <w:rFonts w:ascii="Segoe UI" w:hAnsi="Segoe UI" w:cs="Segoe UI"/>
+          <w:color w:val="1F2328"/>
+          <w:shd w:val="clear" w:color="auto" w:fill="FFFFFF"/>
+        </w:rPr>
+        <w:t xml:space="preserve"> is the appropriate measure</w:t>
+      </w:r>
+      <w:r>
+        <w:rPr>
+          <w:rFonts w:ascii="Segoe UI" w:hAnsi="Segoe UI" w:cs="Segoe UI"/>
+          <w:color w:val="1F2328"/>
+          <w:shd w:val="clear" w:color="auto" w:fill="FFFFFF"/>
+        </w:rPr>
+        <w:t xml:space="preserve"> in our study</w:t>
+      </w:r>
+      <w:r>
+        <w:rPr>
+          <w:rFonts w:ascii="Segoe UI" w:hAnsi="Segoe UI" w:cs="Segoe UI"/>
+          <w:color w:val="1F2328"/>
+          <w:shd w:val="clear" w:color="auto" w:fill="FFFFFF"/>
+        </w:rPr>
+        <w:t>. This is consistent with our broader claim that dysregulation is a network-level property and not the behavior of specific nodes.</w:t>
+      </w:r>
+    </w:p>
+    <w:p>
+      <w:pPr>
+        <w:rPr>
+          <w:rFonts w:ascii="Segoe UI" w:hAnsi="Segoe UI" w:cs="Segoe UI"/>
+          <w:color w:val="1F2328"/>
+          <w:shd w:val="clear" w:color="auto" w:fill="FFFFFF"/>
+        </w:rPr>
+      </w:pPr>
+      <w:r>
+        <w:rPr>
+          <w:rFonts w:ascii="Segoe UI" w:hAnsi="Segoe UI" w:cs="Segoe UI"/>
+          <w:color w:val="1F2328"/>
+          <w:shd w:val="clear" w:color="auto" w:fill="FFFFFF"/>
+        </w:rPr>
+        <w:t xml:space="preserve">Importantly, bacterial scRNA-seq methods are prone to dropouts and </w:t>
+      </w:r>
+      <w:r>
+        <w:rPr>
+          <w:rFonts w:ascii="Segoe UI" w:hAnsi="Segoe UI" w:cs="Segoe UI"/>
+          <w:color w:val="1F2328"/>
+          <w:shd w:val="clear" w:color="auto" w:fill="FFFFFF"/>
+        </w:rPr>
+        <w:t>relatively low-coverage of the data</w:t>
+      </w:r>
+      <w:r>
+        <w:rPr>
+          <w:rFonts w:ascii="Segoe UI" w:hAnsi="Segoe UI" w:cs="Segoe UI"/>
+          <w:color w:val="1F2328"/>
+          <w:shd w:val="clear" w:color="auto" w:fill="FFFFFF"/>
+        </w:rPr>
+        <w:t>. We therefore cannot exclude that recoverable, condition-specific programs would emerge in deeper or higher-coverage data.</w:t>
+      </w:r>
+    </w:p>
+    <w:p>
+      <w:pPr>
+        <w:rPr>
+          <w:rFonts w:ascii="Segoe UI" w:hAnsi="Segoe UI" w:cs="Segoe UI"/>
+          <w:color w:val="1F2328"/>
+          <w:shd w:val="clear" w:color="auto" w:fill="FFFFFF"/>
+        </w:rPr>
+      </w:pPr>
+      <w:r>
+        <w:rPr>
+          <w:rFonts w:ascii="Segoe UI" w:hAnsi="Segoe UI" w:cs="Segoe UI"/>
+          <w:color w:val="1F2328"/>
+          <w:highlight w:val="yellow"/>
+          <w:shd w:val="clear" w:color="auto" w:fill="FFFFFF"/>
+        </w:rPr>
+        <w:t>Following this analysis, we have added a sentence to the discussion summarizing the analysis of eigenvectors.</w:t>
+      </w:r>
+    </w:p>
+    <w:p>
+      <w:pPr>
+        <w:rPr>
+          <w:rFonts w:ascii="Segoe UI" w:hAnsi="Segoe UI" w:cs="Segoe UI"/>
+          <w:color w:val="1F2328"/>
+          <w:shd w:val="clear" w:color="auto" w:fill="FFFFFF"/>
+        </w:rPr>
+      </w:pPr>
+    </w:p>
+    <w:p>
+      <w:pPr>
+        <w:rPr>
+          <w:rFonts w:ascii="Arial" w:hAnsi="Arial" w:cs="Arial"/>
+          <w:i/>
+          <w:iCs/>
+          <w:color w:val="2E74B5" w:themeColor="accent5" w:themeShade="BF"/>
+          <w:shd w:val="clear" w:color="auto" w:fill="FFFFFF"/>
+        </w:rPr>
+      </w:pPr>
+      <w:r>
+        <w:rPr>
           <w:rFonts w:ascii="Arial" w:hAnsi="Arial" w:cs="Arial"/>
           <w:i/>
           <w:iCs/>
@@ -5893,6 +6589,23 @@
           <w:shd w:val="clear" w:color="auto" w:fill="FFFFFF"/>
         </w:rPr>
         <w:t>I think these would be interesting studies to address in the discussion of the current paper, and I would be interested to hear the authors’ thoughts on similarities/differences to their approach and findings.</w:t>
+      </w:r>
+    </w:p>
+    <w:p>
+      <w:pPr>
+        <w:rPr>
+          <w:rFonts w:ascii="Segoe UI" w:hAnsi="Segoe UI" w:cs="Segoe UI"/>
+          <w:color w:val="1F2328"/>
+          <w:shd w:val="clear" w:color="auto" w:fill="FFFFFF"/>
+        </w:rPr>
+      </w:pPr>
+      <w:r>
+        <w:rPr>
+          <w:rFonts w:ascii="Segoe UI" w:hAnsi="Segoe UI" w:cs="Segoe UI"/>
+          <w:color w:val="1F2328"/>
+          <w:shd w:val="clear" w:color="auto" w:fill="FFFFFF"/>
+        </w:rPr>
+        <w:t>See our answer to reviewer #1 comment 2.5</w:t>
       </w:r>
     </w:p>
     <w:sectPr>
@@ -6821,6 +7534,127 @@
   <w16cid:commentId w16cid:paraId="0BFA6802" w16cid:durableId="2D18DF55"/>
   <w16cid:commentId w16cid:paraId="695C72D0" w16cid:durableId="2D124E94"/>
 </w16cid:commentsIds>
+</file>
+
+<file path=word/numbering.xml><?xml version="1.0" encoding="utf-8"?>
+<w:numbering xmlns:wpc="http://schemas.microsoft.com/office/word/2010/wordprocessingCanvas" xmlns:cx="http://schemas.microsoft.com/office/drawing/2014/chartex" xmlns:cx1="http://schemas.microsoft.com/office/drawing/2015/9/8/chartex" xmlns:cx2="http://schemas.microsoft.com/office/drawing/2015/10/21/chartex" xmlns:cx3="http://schemas.microsoft.com/office/drawing/2016/5/9/chartex" xmlns:cx4="http://schemas.microsoft.com/office/drawing/2016/5/10/chartex" xmlns:cx5="http://schemas.microsoft.com/office/drawing/2016/5/11/chartex" xmlns:cx6="http://schemas.microsoft.com/office/drawing/2016/5/12/chartex" xmlns:cx7="http://schemas.microsoft.com/office/drawing/2016/5/13/chartex" xmlns:cx8="http://schemas.microsoft.com/office/drawing/2016/5/14/chartex" xmlns:mc="http://schemas.openxmlformats.org/markup-compatibility/2006" xmlns:aink="http://schemas.microsoft.com/office/drawing/2016/ink" xmlns:am3d="http://schemas.microsoft.com/office/drawing/2017/model3d" xmlns:o="urn:schemas-microsoft-com:office:office" xmlns:oel="http://schemas.microsoft.com/office/2019/extlst" xmlns:r="http://schemas.openxmlformats.org/officeDocument/2006/relationships" xmlns:m="http://schemas.openxmlformats.org/officeDocument/2006/math" xmlns:v="urn:schemas-microsoft-com:vml" xmlns:wp14="http://schemas.microsoft.com/office/word/2010/wordprocessingDrawing" xmlns:wp="http://schemas.openxmlformats.org/drawingml/2006/wordprocessingDrawing" xmlns:w10="urn:schemas-microsoft-com:office:word" xmlns:w="http://schemas.openxmlformats.org/wordprocessingml/2006/main" xmlns:w14="http://schemas.microsoft.com/office/word/2010/wordml" xmlns:w15="http://schemas.microsoft.com/office/word/2012/wordml" xmlns:w16cex="http://schemas.microsoft.com/office/word/2018/wordml/cex" xmlns:w16cid="http://schemas.microsoft.com/office/word/2016/wordml/cid" xmlns:w16="http://schemas.microsoft.com/office/word/2018/wordml" xmlns:w16du="http://schemas.microsoft.com/office/word/2023/wordml/word16du" xmlns:w16sdtdh="http://schemas.microsoft.com/office/word/2020/wordml/sdtdatahash" xmlns:w16sdtfl="http://schemas.microsoft.com/office/word/2024/wordml/sdtformatlock" xmlns:w16se="http://schemas.microsoft.com/office/word/2015/wordml/symex" xmlns:wpg="http://schemas.microsoft.com/office/word/2010/wordprocessingGroup" xmlns:wpi="http://schemas.microsoft.com/office/word/2010/wordprocessingInk" xmlns:wne="http://schemas.microsoft.com/office/word/2006/wordml" xmlns:wps="http://schemas.microsoft.com/office/word/2010/wordprocessingShape" mc:Ignorable="w14 w15 w16se w16cid w16 w16cex w16sdtdh w16sdtfl w16du wp14">
+  <w:abstractNum w:abstractNumId="0" w15:restartNumberingAfterBreak="0">
+    <w:nsid w:val="32EC4D3E"/>
+    <w:multiLevelType w:val="multilevel"/>
+    <w:tmpl w:val="156EA25E"/>
+    <w:lvl w:ilvl="0">
+      <w:start w:val="1"/>
+      <w:numFmt w:val="decimal"/>
+      <w:lvlText w:val="%1."/>
+      <w:lvlJc w:val="left"/>
+      <w:pPr>
+        <w:tabs>
+          <w:tab w:val="num" w:pos="720"/>
+        </w:tabs>
+        <w:ind w:left="720" w:hanging="360"/>
+      </w:pPr>
+    </w:lvl>
+    <w:lvl w:ilvl="1" w:tentative="1">
+      <w:start w:val="1"/>
+      <w:numFmt w:val="decimal"/>
+      <w:lvlText w:val="%2."/>
+      <w:lvlJc w:val="left"/>
+      <w:pPr>
+        <w:tabs>
+          <w:tab w:val="num" w:pos="1440"/>
+        </w:tabs>
+        <w:ind w:left="1440" w:hanging="360"/>
+      </w:pPr>
+    </w:lvl>
+    <w:lvl w:ilvl="2" w:tentative="1">
+      <w:start w:val="1"/>
+      <w:numFmt w:val="decimal"/>
+      <w:lvlText w:val="%3."/>
+      <w:lvlJc w:val="left"/>
+      <w:pPr>
+        <w:tabs>
+          <w:tab w:val="num" w:pos="2160"/>
+        </w:tabs>
+        <w:ind w:left="2160" w:hanging="360"/>
+      </w:pPr>
+    </w:lvl>
+    <w:lvl w:ilvl="3" w:tentative="1">
+      <w:start w:val="1"/>
+      <w:numFmt w:val="decimal"/>
+      <w:lvlText w:val="%4."/>
+      <w:lvlJc w:val="left"/>
+      <w:pPr>
+        <w:tabs>
+          <w:tab w:val="num" w:pos="2880"/>
+        </w:tabs>
+        <w:ind w:left="2880" w:hanging="360"/>
+      </w:pPr>
+    </w:lvl>
+    <w:lvl w:ilvl="4" w:tentative="1">
+      <w:start w:val="1"/>
+      <w:numFmt w:val="decimal"/>
+      <w:lvlText w:val="%5."/>
+      <w:lvlJc w:val="left"/>
+      <w:pPr>
+        <w:tabs>
+          <w:tab w:val="num" w:pos="3600"/>
+        </w:tabs>
+        <w:ind w:left="3600" w:hanging="360"/>
+      </w:pPr>
+    </w:lvl>
+    <w:lvl w:ilvl="5" w:tentative="1">
+      <w:start w:val="1"/>
+      <w:numFmt w:val="decimal"/>
+      <w:lvlText w:val="%6."/>
+      <w:lvlJc w:val="left"/>
+      <w:pPr>
+        <w:tabs>
+          <w:tab w:val="num" w:pos="4320"/>
+        </w:tabs>
+        <w:ind w:left="4320" w:hanging="360"/>
+      </w:pPr>
+    </w:lvl>
+    <w:lvl w:ilvl="6" w:tentative="1">
+      <w:start w:val="1"/>
+      <w:numFmt w:val="decimal"/>
+      <w:lvlText w:val="%7."/>
+      <w:lvlJc w:val="left"/>
+      <w:pPr>
+        <w:tabs>
+          <w:tab w:val="num" w:pos="5040"/>
+        </w:tabs>
+        <w:ind w:left="5040" w:hanging="360"/>
+      </w:pPr>
+    </w:lvl>
+    <w:lvl w:ilvl="7" w:tentative="1">
+      <w:start w:val="1"/>
+      <w:numFmt w:val="decimal"/>
+      <w:lvlText w:val="%8."/>
+      <w:lvlJc w:val="left"/>
+      <w:pPr>
+        <w:tabs>
+          <w:tab w:val="num" w:pos="5760"/>
+        </w:tabs>
+        <w:ind w:left="5760" w:hanging="360"/>
+      </w:pPr>
+    </w:lvl>
+    <w:lvl w:ilvl="8" w:tentative="1">
+      <w:start w:val="1"/>
+      <w:numFmt w:val="decimal"/>
+      <w:lvlText w:val="%9."/>
+      <w:lvlJc w:val="left"/>
+      <w:pPr>
+        <w:tabs>
+          <w:tab w:val="num" w:pos="6480"/>
+        </w:tabs>
+        <w:ind w:left="6480" w:hanging="360"/>
+      </w:pPr>
+    </w:lvl>
+  </w:abstractNum>
+  <w:num w:numId="1" w16cid:durableId="936526695">
+    <w:abstractNumId w:val="0"/>
+  </w:num>
+</w:numbering>
 </file>
 
 <file path=word/people.xml><?xml version="1.0" encoding="utf-8"?>
@@ -7353,6 +8187,54 @@
       <w:contextualSpacing/>
     </w:pPr>
   </w:style>
+  <w:style w:type="paragraph" w:styleId="NormalWeb">
+    <w:name w:val="Normal (Web)"/>
+    <w:basedOn w:val="Normal"/>
+    <w:uiPriority w:val="99"/>
+    <w:semiHidden/>
+    <w:unhideWhenUsed/>
+    <w:rsid w:val="00B00DEA"/>
+    <w:pPr>
+      <w:spacing w:before="100" w:beforeAutospacing="1" w:after="100" w:afterAutospacing="1" w:line="240" w:lineRule="auto"/>
+    </w:pPr>
+    <w:rPr>
+      <w:rFonts w:ascii="Times New Roman" w:eastAsia="Times New Roman" w:hAnsi="Times New Roman" w:cs="Times New Roman"/>
+      <w:sz w:val="24"/>
+      <w:szCs w:val="24"/>
+    </w:rPr>
+  </w:style>
+  <w:style w:type="character" w:styleId="Emphasis">
+    <w:name w:val="Emphasis"/>
+    <w:basedOn w:val="DefaultParagraphFont"/>
+    <w:uiPriority w:val="20"/>
+    <w:qFormat/>
+    <w:rsid w:val="00B00DEA"/>
+    <w:rPr>
+      <w:i/>
+      <w:iCs/>
+    </w:rPr>
+  </w:style>
+  <w:style w:type="character" w:styleId="Strong">
+    <w:name w:val="Strong"/>
+    <w:basedOn w:val="DefaultParagraphFont"/>
+    <w:uiPriority w:val="22"/>
+    <w:qFormat/>
+    <w:rsid w:val="00B00DEA"/>
+    <w:rPr>
+      <w:b/>
+      <w:bCs/>
+    </w:rPr>
+  </w:style>
+  <w:style w:type="character" w:styleId="PlaceholderText">
+    <w:name w:val="Placeholder Text"/>
+    <w:basedOn w:val="DefaultParagraphFont"/>
+    <w:uiPriority w:val="99"/>
+    <w:semiHidden/>
+    <w:rsid w:val="00B00DEA"/>
+    <w:rPr>
+      <w:color w:val="666666"/>
+    </w:rPr>
+  </w:style>
 </w:styles>
 </file>
 

</xml_diff>